<commit_message>
Completamento paragrafo: 2.1, 2.2
</commit_message>
<xml_diff>
--- a/Documentation/Template_IS_2026.docx
+++ b/Documentation/Template_IS_2026.docx
@@ -59,14 +59,14 @@
                     </a:ln>
                     <a:extLst>
                       <a:ext uri="{909E8E84-426E-40dd-AFC4-6F175D3DCCD1}">
-                        <a14:hiddenFill xmlns:ask="http://schemas.microsoft.com/office/drawing/2018/sketchyshapes" xmlns:a14="http://schemas.microsoft.com/office/drawing/2010/main" xmlns:w="http://schemas.openxmlformats.org/wordprocessingml/2006/main" xmlns:w10="urn:schemas-microsoft-com:office:word" xmlns:v="urn:schemas-microsoft-com:vml" xmlns:o="urn:schemas-microsoft-com:office:office" xmlns:mv="urn:schemas-microsoft-com:mac:vml" xmlns:mo="http://schemas.microsoft.com/office/mac/office/2008/main" xmlns="" xmlns:arto="http://schemas.microsoft.com/office/word/2006/arto">
+                        <a14:hiddenFill xmlns:arto="http://schemas.microsoft.com/office/word/2006/arto" xmlns="" xmlns:mo="http://schemas.microsoft.com/office/mac/office/2008/main" xmlns:mv="urn:schemas-microsoft-com:mac:vml" xmlns:o="urn:schemas-microsoft-com:office:office" xmlns:v="urn:schemas-microsoft-com:vml" xmlns:w10="urn:schemas-microsoft-com:office:word" xmlns:w="http://schemas.openxmlformats.org/wordprocessingml/2006/main" xmlns:a14="http://schemas.microsoft.com/office/drawing/2010/main" xmlns:ask="http://schemas.microsoft.com/office/drawing/2018/sketchyshapes">
                           <a:solidFill>
                             <a:srgbClr val="FFFFFF"/>
                           </a:solidFill>
                         </a14:hiddenFill>
                       </a:ext>
                       <a:ext uri="{91240B29-F687-4f45-9708-019B960494DF}">
-                        <a14:hiddenLine xmlns:ask="http://schemas.microsoft.com/office/drawing/2018/sketchyshapes" xmlns:a14="http://schemas.microsoft.com/office/drawing/2010/main" xmlns:w="http://schemas.openxmlformats.org/wordprocessingml/2006/main" xmlns:w10="urn:schemas-microsoft-com:office:word" xmlns:v="urn:schemas-microsoft-com:vml" xmlns:o="urn:schemas-microsoft-com:office:office" xmlns:mv="urn:schemas-microsoft-com:mac:vml" xmlns:mo="http://schemas.microsoft.com/office/mac/office/2008/main" xmlns="" xmlns:arto="http://schemas.microsoft.com/office/word/2006/arto" w="9525">
+                        <a14:hiddenLine xmlns:arto="http://schemas.microsoft.com/office/word/2006/arto" xmlns="" xmlns:mo="http://schemas.microsoft.com/office/mac/office/2008/main" xmlns:mv="urn:schemas-microsoft-com:mac:vml" xmlns:o="urn:schemas-microsoft-com:office:office" xmlns:v="urn:schemas-microsoft-com:vml" xmlns:w10="urn:schemas-microsoft-com:office:word" xmlns:w="http://schemas.openxmlformats.org/wordprocessingml/2006/main" xmlns:a14="http://schemas.microsoft.com/office/drawing/2010/main" xmlns:ask="http://schemas.microsoft.com/office/drawing/2018/sketchyshapes" w="9525">
                           <a:solidFill>
                             <a:srgbClr val="000000"/>
                           </a:solidFill>
@@ -273,17 +273,25 @@
           <w:color w:val="F37A41"/>
           <w:sz w:val="36"/>
           <w:szCs w:val="36"/>
-        </w:rPr>
-      </w:pPr>
-      <w:r>
-        <w:rPr>
+          <w:u w:val="single"/>
+        </w:rPr>
+      </w:pPr>
+      <w:r>
+        <w:rPr>
+          <w:rFonts w:asciiTheme="majorBidi" w:hAnsiTheme="majorBidi" w:cstheme="majorBidi"/>
+          <w:b/>
+          <w:bCs/>
+          <w:i/>
           <w:noProof/>
+          <w:color w:val="F37A41"/>
+          <w:sz w:val="36"/>
+          <w:szCs w:val="36"/>
         </w:rPr>
         <w:drawing>
-          <wp:inline distT="0" distB="0" distL="0" distR="0" wp14:anchorId="6B21F345" wp14:editId="7D9678DB">
-            <wp:extent cx="4726957" cy="2622563"/>
-            <wp:effectExtent l="0" t="0" r="0" b="6350"/>
-            <wp:docPr id="690688247" name="Immagine 4" descr="Immagine che contiene calzature, cartone animato, vestiti, clipart&#10;&#10;Descrizione generata automaticamente"/>
+          <wp:inline distT="0" distB="0" distL="0" distR="0" wp14:anchorId="239D9C63" wp14:editId="5E4B1176">
+            <wp:extent cx="4778829" cy="2650758"/>
+            <wp:effectExtent l="0" t="0" r="3175" b="0"/>
+            <wp:docPr id="580078310" name="Immagine 7"/>
             <wp:cNvGraphicFramePr>
               <a:graphicFrameLocks xmlns:a="http://schemas.openxmlformats.org/drawingml/2006/main" noChangeAspect="1"/>
             </wp:cNvGraphicFramePr>
@@ -291,30 +299,33 @@
               <a:graphicData uri="http://schemas.openxmlformats.org/drawingml/2006/picture">
                 <pic:pic xmlns:pic="http://schemas.openxmlformats.org/drawingml/2006/picture">
                   <pic:nvPicPr>
-                    <pic:cNvPr id="690688247" name="Immagine 4" descr="Immagine che contiene calzature, cartone animato, vestiti, clipart&#10;&#10;Descrizione generata automaticamente"/>
-                    <pic:cNvPicPr/>
+                    <pic:cNvPr id="0" name="Picture 2"/>
+                    <pic:cNvPicPr>
+                      <a:picLocks noChangeAspect="1" noChangeArrowheads="1"/>
+                    </pic:cNvPicPr>
                   </pic:nvPicPr>
-                  <pic:blipFill rotWithShape="1">
-                    <a:blip r:embed="rId12"/>
-                    <a:srcRect t="8053" b="8721"/>
-                    <a:stretch/>
+                  <pic:blipFill>
+                    <a:blip r:embed="rId12">
+                      <a:extLst>
+                        <a:ext uri="{28A0092B-C50C-407E-A947-70E740481C1C}">
+                          <a14:useLocalDpi xmlns:a14="http://schemas.microsoft.com/office/drawing/2010/main" val="0"/>
+                        </a:ext>
+                      </a:extLst>
+                    </a:blip>
+                    <a:srcRect/>
+                    <a:stretch>
+                      <a:fillRect/>
+                    </a:stretch>
                   </pic:blipFill>
                   <pic:spPr bwMode="auto">
                     <a:xfrm>
                       <a:off x="0" y="0"/>
-                      <a:ext cx="4813670" cy="2670672"/>
+                      <a:ext cx="4789827" cy="2656859"/>
                     </a:xfrm>
                     <a:prstGeom prst="rect">
                       <a:avLst/>
                     </a:prstGeom>
-                    <a:ln>
-                      <a:noFill/>
-                    </a:ln>
-                    <a:extLst>
-                      <a:ext uri="{53640926-AAD7-44D8-BBD7-CCE9431645EC}">
-                        <a14:shadowObscured xmlns:a14="http://schemas.microsoft.com/office/drawing/2010/main"/>
-                      </a:ext>
-                    </a:extLst>
+                    <a:noFill/>
                   </pic:spPr>
                 </pic:pic>
               </a:graphicData>
@@ -467,9 +478,9 @@
               </wp:anchor>
             </w:drawing>
           </mc:Choice>
-          <mc:Fallback xmlns:arto="http://schemas.microsoft.com/office/word/2006/arto">
+          <mc:Fallback>
             <w:pict>
-              <v:line w14:anchorId="34B80AA0" id="Connettore 1 5" o:spid="_x0000_s1026" style="position:absolute;z-index:251667456;visibility:visible;mso-wrap-style:square;mso-wrap-distance-left:9pt;mso-wrap-distance-top:0;mso-wrap-distance-right:9pt;mso-wrap-distance-bottom:0;mso-position-horizontal:absolute;mso-position-horizontal-relative:text;mso-position-vertical:absolute;mso-position-vertical-relative:text" from="124.4pt,6.2pt" to="356.55pt,6.2pt" o:gfxdata="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" strokecolor="#f68c36 [3049]" strokeweight="2pt">
+              <v:line w14:anchorId="26063EA4" id="Connettore 1 5" o:spid="_x0000_s1026" style="position:absolute;z-index:251658240;visibility:visible;mso-wrap-style:square;mso-wrap-distance-left:9pt;mso-wrap-distance-top:0;mso-wrap-distance-right:9pt;mso-wrap-distance-bottom:0;mso-position-horizontal:absolute;mso-position-horizontal-relative:text;mso-position-vertical:absolute;mso-position-vertical-relative:text" from="124.4pt,6.2pt" to="356.55pt,6.2pt" o:gfxdata="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" strokecolor="#f68c36 [3049]" strokeweight="2pt">
                 <w10:wrap type="topAndBottom"/>
               </v:line>
             </w:pict>
@@ -3983,33 +3994,6 @@
       </w:r>
     </w:p>
     <w:p>
-      <w:pPr>
-        <w:jc w:val="both"/>
-        <w:rPr>
-          <w:i/>
-          <w:iCs/>
-          <w:color w:val="FF0000"/>
-        </w:rPr>
-      </w:pPr>
-      <w:r>
-        <w:rPr>
-          <w:i/>
-          <w:iCs/>
-          <w:color w:val="FF0000"/>
-        </w:rPr>
-        <w:t>Riportare la Traccia assegnata</w:t>
-      </w:r>
-    </w:p>
-    <w:p>
-      <w:pPr>
-        <w:jc w:val="both"/>
-        <w:rPr>
-          <w:i/>
-          <w:iCs/>
-        </w:rPr>
-      </w:pPr>
-    </w:p>
-    <w:p>
       <w:r>
         <w:t>Si desidera sviluppare un sistema software per la gestione di allenamenti sportivi personalizzati destinati ad atleti seguiti da uno o più allenatori. Il sistema dovrà consentire agli allenatori di pianificare sessioni di allenamento, monitorare i risultati ottenuti e consultare lo storico delle attività svolte, mentre gli atleti potranno visualizzare i propri allenamenti, registrare le prestazioni e seguire il piano assegnato.</w:t>
       </w:r>
@@ -4065,16 +4049,13 @@
     <w:p/>
     <w:p>
       <w:r>
-        <w:t xml:space="preserve">Ogni atleta ha accesso a una sezione del proprio profilo personale in cui può consultare il numero totale di allenamenti completati, l’elenco delle sessioni svolte e quelle ancora da eseguire. L’allenatore, attraverso un’interfaccia dedicata, può monitorare l’andamento complessivo dei propri atleti, visualizzando il numero di sessioni assegnate, il numero di </w:t>
-      </w:r>
+        <w:t>Ogni atleta ha accesso a una sezione del proprio profilo personale in cui può consultare il numero totale di allenamenti completati, l’elenco delle sessioni svolte e quelle ancora da eseguire. L’allenatore, attraverso un’interfaccia dedicata, può monitorare l’andamento complessivo dei propri atleti, visualizzando il numero di sessioni assegnate, il numero di sessioni completate e, opzionalmente, indicatori sintetici relativi alla continuità degli allenamenti.</w:t>
+      </w:r>
+    </w:p>
+    <w:p/>
+    <w:p>
       <w:r>
         <w:lastRenderedPageBreak/>
-        <w:t>sessioni completate e, opzionalmente, indicatori sintetici relativi alla continuità degli allenamenti.</w:t>
-      </w:r>
-    </w:p>
-    <w:p/>
-    <w:p>
-      <w:r>
         <w:t>Il sistema può includere una funzione di ricerca e filtraggio delle sessioni per data, disciplina o stato. Deve inoltre essere possibile visualizzare il profilo sportivo dell’atleta, comprensivo almeno delle informazioni anagrafiche essenziali, della disciplina praticata e degli obiettivi assegnati.</w:t>
       </w:r>
     </w:p>
@@ -4132,92 +4113,713 @@
       </w:pPr>
     </w:p>
     <w:p>
-      <w:r>
-        <w:t xml:space="preserve">Il sistema consente la registrazione di utenti tramite credenziali personali. Al momento della registrazione, ciascun utente deve specificare il proprio ruolo, scegliendo tra atleta o allenatore, oltre a fornire nome, cognome, </w:t>
+      <w:pPr>
+        <w:ind w:left="360"/>
+      </w:pPr>
+      <w:r>
+        <w:rPr>
+          <w:highlight w:val="yellow"/>
+        </w:rPr>
+        <w:t>Il sistema consente la registrazione</w:t>
+      </w:r>
+      <w:r>
+        <w:t xml:space="preserve"> di </w:t>
+      </w:r>
+      <w:r>
+        <w:rPr>
+          <w:highlight w:val="magenta"/>
+        </w:rPr>
+        <w:t>utenti</w:t>
+      </w:r>
+      <w:r>
+        <w:t xml:space="preserve"> tramite credenziali personali. Al momento della registrazione, </w:t>
+      </w:r>
+      <w:r>
+        <w:rPr>
+          <w:highlight w:val="yellow"/>
+        </w:rPr>
+        <w:t>ciascun utente deve specificare il proprio ruolo,</w:t>
+      </w:r>
+      <w:r>
+        <w:t xml:space="preserve"> scegliendo tra </w:t>
+      </w:r>
+      <w:r>
+        <w:rPr>
+          <w:highlight w:val="magenta"/>
+        </w:rPr>
+        <w:t>atleta</w:t>
+      </w:r>
+      <w:r>
+        <w:t xml:space="preserve"> o </w:t>
+      </w:r>
+      <w:r>
+        <w:rPr>
+          <w:highlight w:val="magenta"/>
+        </w:rPr>
+        <w:t>allenatore</w:t>
+      </w:r>
+      <w:r>
+        <w:t xml:space="preserve">, oltre a </w:t>
+      </w:r>
+      <w:r>
+        <w:t xml:space="preserve">fornire </w:t>
+      </w:r>
+      <w:r>
+        <w:rPr>
+          <w:highlight w:val="green"/>
+        </w:rPr>
+        <w:t xml:space="preserve">nome, cognome, </w:t>
       </w:r>
       <w:proofErr w:type="gramStart"/>
       <w:r>
+        <w:rPr>
+          <w:highlight w:val="green"/>
+        </w:rPr>
         <w:t>email</w:t>
       </w:r>
       <w:proofErr w:type="gramEnd"/>
       <w:r>
-        <w:t xml:space="preserve"> e, opzionalmente, una disciplina sportiva prevalente.</w:t>
-      </w:r>
-    </w:p>
-    <w:p/>
-    <w:p>
-      <w:r>
-        <w:t>Ogni allenatore ha la possibilità di creare e gestire il profilo di uno o più atleti associati. Per ciascun atleta è possibile definire informazioni di base, quali disciplina praticata, livello di esperienza ed eventuali obiettivi sportivi. L’associazione tra atleta e allenatore può avvenire direttamente da parte dell’allenatore oppure, per semplicità, tramite un codice univoco fornito all’atleta, che potrà così collegarsi al proprio allenatore.</w:t>
-      </w:r>
-    </w:p>
-    <w:p/>
-    <w:p>
-      <w:r>
-        <w:t>L’allenatore, mediante apposita interfaccia grafica, può creare sessioni di allenamento personalizzate. Ogni sessione è definita da un titolo, una descrizione, una data di svolgimento ed eventualmente una durata prevista. Una sessione può includere uno o più esercizi, ciascuno caratterizzato da un nome, una descrizione, un numero di ripetizioni o una durata prevista, a seconda della tipologia di attività.</w:t>
-      </w:r>
-    </w:p>
-    <w:p/>
-    <w:p>
-      <w:r>
-        <w:t>Ogni atleta autenticato dispone di una propria interfaccia nella quale può visualizzare l’elenco delle sessioni assegnate, ordinate cronologicamente. Selezionando una sessione, l’atleta può consultare il dettaglio degli esercizi previsti e, al termine dell’allenamento, registrare i risultati effettivamente ottenuti. Per ciascun esercizio, il sistema deve consentire di inserire almeno un valore osservato, come ad esempio il numero effettivo di ripetizioni, il tempo impiegato oppure una nota testuale relativa alla prestazione.</w:t>
-      </w:r>
-    </w:p>
-    <w:p/>
-    <w:p>
-      <w:r>
-        <w:t>Una volta che l’atleta ha completato l’inserimento dei dati relativi a una sessione, la sessione può essere marcata come “completata”. In alternativa, può rimanere nello stato “assegnata” finché non viene registrato almeno un risultato. Per semplicità, si può supporre che una sessione possa assumere uno dei seguenti stati: “assegnata”, “in corso” e “completata”.</w:t>
-      </w:r>
-    </w:p>
-    <w:p>
-      <w:r>
-        <w:t>L’allenatore può consultare in ogni momento lo storico degli allenamenti svolti da ciascun atleta, visualizzando sia il piano originariamente assegnato sia i risultati effettivamente registrati. Deve inoltre essere possibile accedere al dettaglio delle singole sessioni e monitorare l’andamento delle prestazioni nel tempo.</w:t>
-      </w:r>
-    </w:p>
-    <w:p/>
-    <w:p>
-      <w:r>
-        <w:t>Ogni atleta ha accesso a una sezione del proprio profilo personale in cui può consultare il numero totale di allenamenti completati, l’elenco delle sessioni svolte e quelle ancora da eseguire. L’allenatore, attraverso un’interfaccia dedicata, può monitorare l’andamento complessivo dei propri atleti, visualizzando il numero di sessioni assegnate, il numero di sessioni completate e, opzionalmente, indicatori sintetici relativi alla continuità degli allenamenti.</w:t>
-      </w:r>
-    </w:p>
-    <w:p/>
-    <w:p>
-      <w:r>
-        <w:t>Il sistema può includere una funzione di ricerca e filtraggio delle sessioni per data, disciplina o stato. Deve inoltre essere possibile visualizzare il profilo sportivo dell’atleta, comprensivo almeno delle informazioni anagrafiche essenziali, della disciplina praticata e degli obiettivi assegnati.</w:t>
-      </w:r>
-    </w:p>
-    <w:p/>
-    <w:p>
-      <w:pPr>
-        <w:jc w:val="both"/>
-      </w:pPr>
-      <w:r>
-        <w:lastRenderedPageBreak/>
-        <w:t>Il sistema dovrà essere accessibile via web sia da desktop che da dispositivi mobili, con un’interfaccia grafica intuitiva e responsiva. È previsto un sistema di notifiche che avvisi l’atleta dell’assegnazione di un nuovo allenamento e l’allenatore del completamento di una sessione. Il sistema dovrà inoltre garantire la protezione dei dati personali, la sicurezza delle informazioni salvate e una corretta gestione dei permessi tra atleti e allenatori.</w:t>
-      </w:r>
-    </w:p>
-    <w:p>
-      <w:pPr>
-        <w:jc w:val="both"/>
-      </w:pPr>
-    </w:p>
-    <w:p>
-      <w:pPr>
-        <w:jc w:val="both"/>
-      </w:pPr>
+        <w:t xml:space="preserve"> e, opzionalmente, una </w:t>
+      </w:r>
+      <w:r>
+        <w:rPr>
+          <w:highlight w:val="green"/>
+        </w:rPr>
+        <w:t>disciplina sportiva</w:t>
+      </w:r>
+      <w:r>
+        <w:t xml:space="preserve"> </w:t>
+      </w:r>
+      <w:r>
+        <w:t>prevalente.</w:t>
+      </w:r>
+    </w:p>
+    <w:p>
+      <w:pPr>
+        <w:ind w:left="360"/>
+      </w:pPr>
+      <w:r>
+        <w:t xml:space="preserve">Ogni </w:t>
+      </w:r>
+      <w:r>
+        <w:rPr>
+          <w:highlight w:val="yellow"/>
+        </w:rPr>
+        <w:t>allenatore</w:t>
+      </w:r>
+      <w:r>
+        <w:t xml:space="preserve"> ha la possibilità di </w:t>
+      </w:r>
+      <w:r>
+        <w:rPr>
+          <w:highlight w:val="yellow"/>
+        </w:rPr>
+        <w:t>creare e gestire il profilo di uno o più atleti associati</w:t>
+      </w:r>
+      <w:r>
+        <w:t xml:space="preserve">. Per ciascun </w:t>
+      </w:r>
+      <w:r>
+        <w:t>atleta è possibile definire informazioni di base, quali</w:t>
+      </w:r>
+      <w:r>
+        <w:t xml:space="preserve"> </w:t>
+      </w:r>
+      <w:r>
+        <w:rPr>
+          <w:highlight w:val="green"/>
+        </w:rPr>
+        <w:t>disciplina praticata</w:t>
+      </w:r>
+      <w:r>
+        <w:t xml:space="preserve">, </w:t>
+      </w:r>
+      <w:r>
+        <w:rPr>
+          <w:highlight w:val="green"/>
+        </w:rPr>
+        <w:t>livello di esperienza</w:t>
+      </w:r>
+      <w:r>
+        <w:t xml:space="preserve"> ed </w:t>
+      </w:r>
+      <w:r>
+        <w:rPr>
+          <w:highlight w:val="green"/>
+        </w:rPr>
+        <w:t>eventuali obiettivi sportivi</w:t>
+      </w:r>
+      <w:r>
+        <w:t xml:space="preserve">. </w:t>
+      </w:r>
+      <w:r>
+        <w:rPr>
+          <w:highlight w:val="yellow"/>
+        </w:rPr>
+        <w:t>L’associazione tra atleta e allenatore può avvenire direttamente da parte dell’allenatore</w:t>
+      </w:r>
+      <w:r>
+        <w:t xml:space="preserve"> oppure, per semplicità, </w:t>
+      </w:r>
+      <w:r>
+        <w:rPr>
+          <w:highlight w:val="yellow"/>
+        </w:rPr>
+        <w:t>tramite</w:t>
+      </w:r>
+      <w:r>
+        <w:t xml:space="preserve"> un </w:t>
+      </w:r>
+      <w:r>
+        <w:rPr>
+          <w:highlight w:val="green"/>
+        </w:rPr>
+        <w:t>codice univoco</w:t>
+      </w:r>
+      <w:r>
+        <w:t xml:space="preserve"> </w:t>
+      </w:r>
+      <w:r>
+        <w:rPr>
+          <w:highlight w:val="yellow"/>
+        </w:rPr>
+        <w:t>fornito all’atleta, che potrà così collegarsi al proprio allenatore.</w:t>
+      </w:r>
+    </w:p>
+    <w:p>
+      <w:pPr>
+        <w:ind w:left="360"/>
+      </w:pPr>
+      <w:r>
+        <w:rPr>
+          <w:highlight w:val="yellow"/>
+        </w:rPr>
+        <w:t>L’allenatore,</w:t>
+      </w:r>
+      <w:r>
+        <w:t xml:space="preserve"> mediante apposita interfaccia grafica</w:t>
+      </w:r>
+      <w:r>
+        <w:rPr>
+          <w:highlight w:val="yellow"/>
+        </w:rPr>
+        <w:t>, può creare sessioni di</w:t>
+      </w:r>
+      <w:r>
+        <w:t xml:space="preserve"> </w:t>
+      </w:r>
+      <w:r>
+        <w:rPr>
+          <w:highlight w:val="yellow"/>
+        </w:rPr>
+        <w:t>allenamento personalizzate</w:t>
+      </w:r>
+      <w:r>
+        <w:t xml:space="preserve">. Ogni </w:t>
+      </w:r>
       <w:r>
         <w:rPr>
           <w:highlight w:val="cyan"/>
         </w:rPr>
-        <w:t xml:space="preserve">Parco auto = </w:t>
+        <w:t>sessione</w:t>
+      </w:r>
+      <w:r>
+        <w:t xml:space="preserve"> è definita da un </w:t>
+      </w:r>
+      <w:r>
+        <w:rPr>
+          <w:highlight w:val="green"/>
+        </w:rPr>
+        <w:t>titolo</w:t>
+      </w:r>
+      <w:r>
+        <w:t xml:space="preserve">, una </w:t>
+      </w:r>
+      <w:r>
+        <w:rPr>
+          <w:highlight w:val="green"/>
+        </w:rPr>
+        <w:t>descrizione</w:t>
+      </w:r>
+      <w:r>
+        <w:t xml:space="preserve">, una </w:t>
+      </w:r>
+      <w:r>
+        <w:rPr>
+          <w:highlight w:val="green"/>
+        </w:rPr>
+        <w:t>data di svolgimento</w:t>
+      </w:r>
+      <w:r>
+        <w:t xml:space="preserve"> ed eventualmente una </w:t>
+      </w:r>
+      <w:r>
+        <w:rPr>
+          <w:highlight w:val="green"/>
+        </w:rPr>
+        <w:t>durata prevista</w:t>
+      </w:r>
+      <w:r>
+        <w:t xml:space="preserve">. Una </w:t>
+      </w:r>
+      <w:r>
+        <w:rPr>
+          <w:highlight w:val="yellow"/>
+        </w:rPr>
+        <w:t>sessione</w:t>
+      </w:r>
+      <w:r>
+        <w:t xml:space="preserve"> può </w:t>
+      </w:r>
+      <w:r>
+        <w:rPr>
+          <w:highlight w:val="yellow"/>
+        </w:rPr>
+        <w:t xml:space="preserve">includere uno o più </w:t>
       </w:r>
       <w:r>
         <w:rPr>
           <w:highlight w:val="cyan"/>
         </w:rPr>
-        <w:t>Autonoleggio</w:t>
+        <w:t>esercizi</w:t>
+      </w:r>
+      <w:r>
+        <w:t xml:space="preserve">, ciascuno caratterizzato da un </w:t>
+      </w:r>
+      <w:r>
+        <w:rPr>
+          <w:highlight w:val="green"/>
+        </w:rPr>
+        <w:t>nome</w:t>
+      </w:r>
+      <w:r>
+        <w:t xml:space="preserve">, una </w:t>
+      </w:r>
+      <w:r>
+        <w:rPr>
+          <w:highlight w:val="green"/>
+        </w:rPr>
+        <w:t>descrizione</w:t>
+      </w:r>
+      <w:r>
+        <w:t xml:space="preserve">, un </w:t>
+      </w:r>
+      <w:r>
+        <w:rPr>
+          <w:highlight w:val="green"/>
+        </w:rPr>
+        <w:t>numero di ripetizioni</w:t>
+      </w:r>
+      <w:r>
+        <w:t xml:space="preserve"> o una </w:t>
+      </w:r>
+      <w:r>
+        <w:rPr>
+          <w:highlight w:val="green"/>
+        </w:rPr>
+        <w:t>durata prevista</w:t>
+      </w:r>
+      <w:r>
+        <w:t xml:space="preserve">, a seconda </w:t>
+      </w:r>
+      <w:r>
+        <w:t>della tipologia di attività.</w:t>
+      </w:r>
+    </w:p>
+    <w:p>
+      <w:pPr>
+        <w:ind w:left="360"/>
+      </w:pPr>
+      <w:r>
+        <w:rPr>
+          <w:highlight w:val="yellow"/>
+        </w:rPr>
+        <w:t>Ogni atleta</w:t>
+      </w:r>
+      <w:r>
+        <w:t xml:space="preserve"> autenticato dispone di una propria interfaccia nella quale può </w:t>
+      </w:r>
+      <w:r>
+        <w:rPr>
+          <w:highlight w:val="yellow"/>
+        </w:rPr>
+        <w:t>visualizzare l’elenco delle sessioni assegnate, ordinate</w:t>
+      </w:r>
+      <w:r>
+        <w:t xml:space="preserve"> </w:t>
+      </w:r>
+      <w:r>
+        <w:rPr>
+          <w:highlight w:val="yellow"/>
+        </w:rPr>
+        <w:t>cronologicamente</w:t>
+      </w:r>
+      <w:r>
+        <w:t xml:space="preserve">. </w:t>
+      </w:r>
+      <w:r>
+        <w:rPr>
+          <w:highlight w:val="yellow"/>
+        </w:rPr>
+        <w:t>Selezionando una sessione</w:t>
+      </w:r>
+      <w:r>
+        <w:t xml:space="preserve">, </w:t>
+      </w:r>
+      <w:r>
+        <w:rPr>
+          <w:highlight w:val="yellow"/>
+        </w:rPr>
+        <w:t>l’atleta può consultare il dettaglio degli esercizi previsti</w:t>
+      </w:r>
+      <w:r>
+        <w:t xml:space="preserve"> e</w:t>
+      </w:r>
+      <w:r>
+        <w:rPr>
+          <w:highlight w:val="yellow"/>
+        </w:rPr>
+        <w:t>, al termine dell’allenamento</w:t>
+      </w:r>
+      <w:r>
+        <w:t xml:space="preserve">, </w:t>
+      </w:r>
+      <w:r>
+        <w:rPr>
+          <w:highlight w:val="yellow"/>
+        </w:rPr>
+        <w:t>registrare i risultati effettivamente ottenuti</w:t>
+      </w:r>
+      <w:r>
+        <w:t xml:space="preserve">. </w:t>
+      </w:r>
+      <w:r>
+        <w:rPr>
+          <w:highlight w:val="yellow"/>
+        </w:rPr>
+        <w:t>Per</w:t>
+      </w:r>
+      <w:r>
+        <w:t xml:space="preserve"> </w:t>
+      </w:r>
+      <w:r>
+        <w:rPr>
+          <w:highlight w:val="yellow"/>
+        </w:rPr>
+        <w:t>ciascun esercizio</w:t>
+      </w:r>
+      <w:r>
+        <w:t xml:space="preserve">, il </w:t>
+      </w:r>
+      <w:r>
+        <w:rPr>
+          <w:highlight w:val="yellow"/>
+        </w:rPr>
+        <w:t xml:space="preserve">sistema deve consentire di inserire almeno un </w:t>
+      </w:r>
+      <w:r>
+        <w:rPr>
+          <w:highlight w:val="green"/>
+        </w:rPr>
+        <w:t>valore osservato</w:t>
+      </w:r>
+      <w:r>
+        <w:rPr>
+          <w:highlight w:val="yellow"/>
+        </w:rPr>
+        <w:t>,</w:t>
+      </w:r>
+      <w:r>
+        <w:t xml:space="preserve"> come ad esempio </w:t>
+      </w:r>
+      <w:r>
+        <w:rPr>
+          <w:highlight w:val="green"/>
+        </w:rPr>
+        <w:t>il numero effettivo di ripetizioni</w:t>
+      </w:r>
+      <w:r>
+        <w:t xml:space="preserve">, </w:t>
+      </w:r>
+      <w:r>
+        <w:rPr>
+          <w:highlight w:val="green"/>
+        </w:rPr>
+        <w:t>il tempo impiegato</w:t>
+      </w:r>
+      <w:r>
+        <w:t xml:space="preserve"> oppure una </w:t>
+      </w:r>
+      <w:r>
+        <w:rPr>
+          <w:highlight w:val="green"/>
+        </w:rPr>
+        <w:t>nota testuale</w:t>
+      </w:r>
+      <w:r>
+        <w:t xml:space="preserve"> relativa alla prestazione.</w:t>
+      </w:r>
+    </w:p>
+    <w:p>
+      <w:pPr>
+        <w:ind w:left="360"/>
+      </w:pPr>
+      <w:r>
+        <w:rPr>
+          <w:highlight w:val="yellow"/>
+        </w:rPr>
+        <w:t>Una volta che l’atleta ha completato l’inserimento dei dati relativi a una sessione</w:t>
+      </w:r>
+      <w:r>
+        <w:t xml:space="preserve">, </w:t>
+      </w:r>
+      <w:r>
+        <w:rPr>
+          <w:highlight w:val="yellow"/>
+        </w:rPr>
+        <w:t>la sessione può essere marcata come “</w:t>
+      </w:r>
+      <w:r>
+        <w:rPr>
+          <w:highlight w:val="yellow"/>
+        </w:rPr>
+        <w:t>completata”.</w:t>
+      </w:r>
+      <w:r>
+        <w:t xml:space="preserve"> </w:t>
+      </w:r>
+      <w:r>
+        <w:rPr>
+          <w:highlight w:val="yellow"/>
+        </w:rPr>
+        <w:t xml:space="preserve">In alternativa, può rimanere nello </w:t>
+      </w:r>
+      <w:r>
+        <w:rPr>
+          <w:highlight w:val="green"/>
+        </w:rPr>
+        <w:t xml:space="preserve">stato </w:t>
+      </w:r>
+      <w:r>
+        <w:rPr>
+          <w:highlight w:val="yellow"/>
+        </w:rPr>
+        <w:t>“</w:t>
+      </w:r>
+      <w:r>
+        <w:rPr>
+          <w:highlight w:val="yellow"/>
+        </w:rPr>
+        <w:t xml:space="preserve">assegnata” finché </w:t>
+      </w:r>
+      <w:r>
+        <w:rPr>
+          <w:highlight w:val="yellow"/>
+        </w:rPr>
+        <w:t>non viene registrato almeno un risultato.</w:t>
+      </w:r>
+      <w:r>
+        <w:t xml:space="preserve"> Per semplicità, si può supporre che una sessione possa assumere uno dei seguenti stati</w:t>
+      </w:r>
+      <w:r>
+        <w:rPr>
+          <w:highlight w:val="lightGray"/>
+        </w:rPr>
+        <w:t xml:space="preserve">: </w:t>
+      </w:r>
+      <w:r>
+        <w:rPr>
+          <w:highlight w:val="yellow"/>
+        </w:rPr>
+        <w:t>“assegnata”,</w:t>
+      </w:r>
+      <w:r>
+        <w:t xml:space="preserve"> </w:t>
+      </w:r>
+      <w:r>
+        <w:rPr>
+          <w:highlight w:val="yellow"/>
+        </w:rPr>
+        <w:t>“in corso” e “completata”.</w:t>
+      </w:r>
+    </w:p>
+    <w:p>
+      <w:pPr>
+        <w:ind w:left="360"/>
+      </w:pPr>
+      <w:r>
+        <w:rPr>
+          <w:highlight w:val="yellow"/>
+        </w:rPr>
+        <w:t>L’allenatore può consultare in ogni momento lo storico degli allenamenti svolti da ciascun atleta</w:t>
+      </w:r>
+      <w:r>
+        <w:t xml:space="preserve">, </w:t>
+      </w:r>
+      <w:r>
+        <w:rPr>
+          <w:highlight w:val="yellow"/>
+        </w:rPr>
+        <w:t>visualizzando sia il piano originariamente assegnato sia i risultati effettivamente registrati</w:t>
+      </w:r>
+      <w:r>
+        <w:t xml:space="preserve">. Deve inoltre essere </w:t>
+      </w:r>
+      <w:r>
+        <w:rPr>
+          <w:highlight w:val="yellow"/>
+        </w:rPr>
+        <w:t>possibile accedere al dettaglio delle singole sessioni e monitorare l’andamento delle prestazioni nel tempo</w:t>
       </w:r>
       <w:r>
         <w:t>.</w:t>
+      </w:r>
+    </w:p>
+    <w:p>
+      <w:pPr>
+        <w:ind w:left="360"/>
+      </w:pPr>
+      <w:r>
+        <w:rPr>
+          <w:highlight w:val="yellow"/>
+        </w:rPr>
+        <w:t>Ogni atleta ha accesso a una sezione</w:t>
+      </w:r>
+      <w:r>
+        <w:t xml:space="preserve"> del proprio profilo personale in cui può </w:t>
+      </w:r>
+      <w:r>
+        <w:rPr>
+          <w:highlight w:val="yellow"/>
+        </w:rPr>
+        <w:t>consultare il numero totale di allenamenti completati</w:t>
+      </w:r>
+      <w:r>
+        <w:t xml:space="preserve">, </w:t>
+      </w:r>
+      <w:r>
+        <w:rPr>
+          <w:highlight w:val="yellow"/>
+        </w:rPr>
+        <w:t>l’elenco delle sessioni svolte e quelle ancora da eseguire</w:t>
+      </w:r>
+      <w:r>
+        <w:t xml:space="preserve">. </w:t>
+      </w:r>
+      <w:r>
+        <w:rPr>
+          <w:highlight w:val="yellow"/>
+        </w:rPr>
+        <w:t>L’allenatore</w:t>
+      </w:r>
+      <w:r>
+        <w:t xml:space="preserve">, attraverso un’interfaccia dedicata, </w:t>
+      </w:r>
+      <w:r>
+        <w:rPr>
+          <w:highlight w:val="yellow"/>
+        </w:rPr>
+        <w:t>può monitorare l’andamento complessivo dei propri atleti</w:t>
+      </w:r>
+      <w:r>
+        <w:t xml:space="preserve">, </w:t>
+      </w:r>
+      <w:r>
+        <w:rPr>
+          <w:highlight w:val="yellow"/>
+        </w:rPr>
+        <w:t>visualizzando il numero di sessioni assegnate, il numero di sessioni completate e, opzionalmente, indicatori sintetici relativi alla continuità degli allenamenti.</w:t>
+      </w:r>
+    </w:p>
+    <w:p>
+      <w:pPr>
+        <w:ind w:left="360"/>
+      </w:pPr>
+      <w:r>
+        <w:t xml:space="preserve">Il sistema può includere </w:t>
+      </w:r>
+      <w:r>
+        <w:rPr>
+          <w:highlight w:val="yellow"/>
+        </w:rPr>
+        <w:t>una funzione di ricerca e filtraggio delle sessioni per data</w:t>
+      </w:r>
+      <w:r>
+        <w:t xml:space="preserve">, </w:t>
+      </w:r>
+      <w:r>
+        <w:rPr>
+          <w:highlight w:val="yellow"/>
+        </w:rPr>
+        <w:t>disciplina o stato.</w:t>
+      </w:r>
+      <w:r>
+        <w:t xml:space="preserve"> Deve inoltre essere </w:t>
+      </w:r>
+      <w:r>
+        <w:rPr>
+          <w:highlight w:val="yellow"/>
+        </w:rPr>
+        <w:t>possibile visualizzare il profilo sportivo dell’atleta</w:t>
+      </w:r>
+      <w:r>
+        <w:t xml:space="preserve">, </w:t>
+      </w:r>
+      <w:r>
+        <w:rPr>
+          <w:highlight w:val="yellow"/>
+        </w:rPr>
+        <w:t>comprensivo almeno delle informazioni anagrafiche essenziali</w:t>
+      </w:r>
+      <w:r>
+        <w:t xml:space="preserve">, della </w:t>
+      </w:r>
+      <w:r>
+        <w:rPr>
+          <w:highlight w:val="yellow"/>
+        </w:rPr>
+        <w:t>disciplina praticata e degli obiettivi assegnati</w:t>
+      </w:r>
+      <w:r>
+        <w:t>.</w:t>
+      </w:r>
+    </w:p>
+    <w:p>
+      <w:pPr>
+        <w:ind w:left="360"/>
+      </w:pPr>
+      <w:r>
+        <w:rPr>
+          <w:highlight w:val="yellow"/>
+        </w:rPr>
+        <w:t>Il sistema dovrà essere accessibile via web sia da desktop che da dispositivi mobili</w:t>
+      </w:r>
+      <w:r>
+        <w:t xml:space="preserve">, con </w:t>
+      </w:r>
+      <w:r>
+        <w:rPr>
+          <w:highlight w:val="yellow"/>
+        </w:rPr>
+        <w:t>un’interfaccia grafica intuitiva e responsiva</w:t>
+      </w:r>
+      <w:r>
+        <w:t xml:space="preserve">. </w:t>
+      </w:r>
+      <w:r>
+        <w:rPr>
+          <w:highlight w:val="yellow"/>
+        </w:rPr>
+        <w:t>È previsto un sistema di notifiche che avvisi l’atleta dell’assegnazione di un nuovo allenamento e l’allenatore del completamento di una sessione</w:t>
+      </w:r>
+      <w:r>
+        <w:t xml:space="preserve">. Il sistema dovrà </w:t>
+      </w:r>
+      <w:r>
+        <w:rPr>
+          <w:highlight w:val="yellow"/>
+        </w:rPr>
+        <w:t>inoltre garantire la protezione dei dati personali, la sicurezza delle informazioni salvate e una corretta gestione dei permessi tra atleti e allenatori.</w:t>
       </w:r>
     </w:p>
     <w:p>
@@ -4244,6 +4846,7 @@
         <w:rPr>
           <w:i/>
         </w:rPr>
+        <w:lastRenderedPageBreak/>
         <w:t>LEGENDA:</w:t>
       </w:r>
       <w:r>
@@ -4352,632 +4955,15 @@
       <w:bookmarkEnd w:id="14"/>
       <w:bookmarkEnd w:id="15"/>
     </w:p>
-    <w:p>
-      <w:pPr>
-        <w:rPr>
-          <w:highlight w:val="yellow"/>
-        </w:rPr>
-      </w:pPr>
-      <w:r>
-        <w:rPr>
-          <w:highlight w:val="yellow"/>
-        </w:rPr>
-        <w:t>Riportare la traccia revisionata</w:t>
-      </w:r>
-      <w:r>
-        <w:rPr>
-          <w:highlight w:val="yellow"/>
-        </w:rPr>
-        <w:t>,</w:t>
-      </w:r>
-      <w:r>
-        <w:rPr>
-          <w:highlight w:val="yellow"/>
-        </w:rPr>
-        <w:t xml:space="preserve"> a seguito di </w:t>
-      </w:r>
-      <w:r>
-        <w:rPr>
-          <w:highlight w:val="yellow"/>
-        </w:rPr>
-        <w:t xml:space="preserve">una interazione (simulata) con gli </w:t>
-      </w:r>
-      <w:r>
-        <w:rPr>
-          <w:i/>
-          <w:highlight w:val="yellow"/>
-        </w:rPr>
-        <w:t>stakeholders</w:t>
-      </w:r>
-      <w:r>
-        <w:rPr>
-          <w:highlight w:val="yellow"/>
-        </w:rPr>
-        <w:t xml:space="preserve">, che produce </w:t>
-      </w:r>
-      <w:r>
-        <w:rPr>
-          <w:highlight w:val="yellow"/>
-        </w:rPr>
-        <w:t xml:space="preserve">chiarimenti, disambiguazione di termini, ristrutturazione delle frasi che esprimono più requisiti, separazione </w:t>
-      </w:r>
-      <w:r>
-        <w:rPr>
-          <w:highlight w:val="yellow"/>
-        </w:rPr>
-        <w:t>delle frasi che esprimono</w:t>
-      </w:r>
-      <w:r>
-        <w:rPr>
-          <w:highlight w:val="yellow"/>
-        </w:rPr>
-        <w:t xml:space="preserve"> requisiti funzionali e requisiti sui dati, etc. </w:t>
-      </w:r>
-    </w:p>
-    <w:p>
-      <w:pPr>
-        <w:rPr>
-          <w:highlight w:val="yellow"/>
-        </w:rPr>
-      </w:pPr>
-      <w:r>
-        <w:rPr>
-          <w:highlight w:val="yellow"/>
-        </w:rPr>
-        <w:t>Nella revisione, frasi lunghe, frasi che esprimono più di un requisito, frasi ambigue, etc., vanno opportunamente separate, riformulate, disambiguate. Esprimere i requisiti funzionali con frasi del tipo “Il sistema deve …”</w:t>
-      </w:r>
-    </w:p>
-    <w:p>
-      <w:pPr>
-        <w:rPr>
-          <w:highlight w:val="yellow"/>
-        </w:rPr>
-      </w:pPr>
-    </w:p>
-    <w:p>
-      <w:pPr>
-        <w:rPr>
-          <w:highlight w:val="yellow"/>
-        </w:rPr>
-      </w:pPr>
-      <w:r>
-        <w:rPr>
-          <w:highlight w:val="yellow"/>
-        </w:rPr>
-        <w:t>Esempio:</w:t>
-      </w:r>
-    </w:p>
-    <w:p>
-      <w:pPr>
-        <w:ind w:left="360"/>
-        <w:jc w:val="both"/>
-        <w:rPr>
-          <w:i/>
-          <w:iCs/>
-        </w:rPr>
-      </w:pPr>
-    </w:p>
-    <w:p>
-      <w:pPr>
-        <w:ind w:left="360"/>
-        <w:jc w:val="both"/>
-        <w:rPr>
-          <w:i/>
-          <w:iCs/>
-        </w:rPr>
-      </w:pPr>
-    </w:p>
-    <w:p>
-      <w:pPr>
-        <w:ind w:left="360"/>
-        <w:jc w:val="both"/>
-        <w:rPr>
-          <w:i/>
-          <w:iCs/>
-        </w:rPr>
-      </w:pPr>
-    </w:p>
+    <w:p/>
     <w:p>
       <w:pPr>
         <w:pStyle w:val="Paragrafoelenco"/>
         <w:numPr>
           <w:ilvl w:val="0"/>
-          <w:numId w:val="7"/>
+          <w:numId w:val="99"/>
         </w:numPr>
-        <w:jc w:val="both"/>
-      </w:pPr>
-      <w:r>
-        <w:rPr>
-          <w:i/>
-          <w:iCs/>
-        </w:rPr>
-        <w:t xml:space="preserve">Il </w:t>
-      </w:r>
-      <w:r>
-        <w:rPr>
-          <w:i/>
-          <w:iCs/>
-        </w:rPr>
-        <w:t xml:space="preserve">sistema deve </w:t>
-      </w:r>
-      <w:r>
-        <w:rPr>
-          <w:i/>
-          <w:iCs/>
-        </w:rPr>
-        <w:t>offrire all’Utente una funzionalità per registrarsi</w:t>
-      </w:r>
-      <w:r>
-        <w:rPr>
-          <w:i/>
-          <w:iCs/>
-        </w:rPr>
-        <w:t>.</w:t>
-      </w:r>
-    </w:p>
-    <w:p>
-      <w:pPr>
-        <w:pStyle w:val="Paragrafoelenco"/>
-        <w:numPr>
-          <w:ilvl w:val="0"/>
-          <w:numId w:val="7"/>
-        </w:numPr>
-        <w:jc w:val="both"/>
-      </w:pPr>
-      <w:r>
-        <w:rPr>
-          <w:i/>
-          <w:iCs/>
-        </w:rPr>
-        <w:t xml:space="preserve">Il sistema deve </w:t>
-      </w:r>
-      <w:r>
-        <w:rPr>
-          <w:i/>
-          <w:iCs/>
-        </w:rPr>
-        <w:t>offrire al Cliente una funzionalità per accedere</w:t>
-      </w:r>
-      <w:r>
-        <w:rPr>
-          <w:i/>
-          <w:iCs/>
-        </w:rPr>
-        <w:t>.</w:t>
-      </w:r>
-    </w:p>
-    <w:p>
-      <w:pPr>
-        <w:pStyle w:val="Paragrafoelenco"/>
-        <w:numPr>
-          <w:ilvl w:val="0"/>
-          <w:numId w:val="7"/>
-        </w:numPr>
-        <w:jc w:val="both"/>
-      </w:pPr>
-      <w:r>
-        <w:rPr>
-          <w:i/>
-          <w:iCs/>
-        </w:rPr>
-        <w:t xml:space="preserve">Il sistema deve </w:t>
-      </w:r>
-      <w:r>
-        <w:rPr>
-          <w:i/>
-          <w:iCs/>
-        </w:rPr>
-        <w:t>offrire</w:t>
-      </w:r>
-      <w:r>
-        <w:rPr>
-          <w:i/>
-          <w:iCs/>
-        </w:rPr>
-        <w:t xml:space="preserve"> a</w:t>
-      </w:r>
-      <w:r>
-        <w:rPr>
-          <w:i/>
-          <w:iCs/>
-        </w:rPr>
-        <w:t>l Cliente</w:t>
-      </w:r>
-      <w:r>
-        <w:rPr>
-          <w:i/>
-          <w:iCs/>
-        </w:rPr>
-        <w:t xml:space="preserve"> </w:t>
-      </w:r>
-      <w:r>
-        <w:rPr>
-          <w:i/>
-          <w:iCs/>
-        </w:rPr>
-        <w:t>una funzionalità</w:t>
-      </w:r>
-      <w:r>
-        <w:rPr>
-          <w:i/>
-          <w:iCs/>
-        </w:rPr>
-        <w:t xml:space="preserve"> </w:t>
-      </w:r>
-      <w:r>
-        <w:rPr>
-          <w:i/>
-          <w:iCs/>
-        </w:rPr>
-        <w:t xml:space="preserve">per </w:t>
-      </w:r>
-      <w:r>
-        <w:rPr>
-          <w:i/>
-          <w:iCs/>
-        </w:rPr>
-        <w:t>visualizzare un elenco di auto disponibili per il noleggio.</w:t>
-      </w:r>
-    </w:p>
-    <w:p>
-      <w:pPr>
-        <w:pStyle w:val="Paragrafoelenco"/>
-        <w:numPr>
-          <w:ilvl w:val="0"/>
-          <w:numId w:val="7"/>
-        </w:numPr>
-        <w:jc w:val="both"/>
-      </w:pPr>
-      <w:r>
-        <w:rPr>
-          <w:i/>
-          <w:iCs/>
-        </w:rPr>
-        <w:t xml:space="preserve">Di ogni </w:t>
-      </w:r>
-      <w:r>
-        <w:rPr>
-          <w:i/>
-          <w:iCs/>
-        </w:rPr>
-        <w:t>A</w:t>
-      </w:r>
-      <w:r>
-        <w:rPr>
-          <w:i/>
-          <w:iCs/>
-        </w:rPr>
-        <w:t>uto si vuole memorizzare modello, cilindrata, costo giornaliero, disponibilità e tipo di patente richiesta per la guida.</w:t>
-      </w:r>
-    </w:p>
-    <w:p>
-      <w:pPr>
-        <w:pStyle w:val="Paragrafoelenco"/>
-        <w:numPr>
-          <w:ilvl w:val="0"/>
-          <w:numId w:val="7"/>
-        </w:numPr>
-        <w:jc w:val="both"/>
-      </w:pPr>
-      <w:r>
-        <w:rPr>
-          <w:i/>
-          <w:iCs/>
-        </w:rPr>
-        <w:t xml:space="preserve">Di ogni </w:t>
-      </w:r>
-      <w:r>
-        <w:rPr>
-          <w:i/>
-          <w:iCs/>
-        </w:rPr>
-        <w:t>C</w:t>
-      </w:r>
-      <w:r>
-        <w:rPr>
-          <w:i/>
-          <w:iCs/>
-        </w:rPr>
-        <w:t>liente si vuole memorizzare nome, cognome, patente, con relativa tipologia, e credito disponibile.</w:t>
-      </w:r>
-    </w:p>
-    <w:p>
-      <w:pPr>
-        <w:pStyle w:val="Paragrafoelenco"/>
-        <w:numPr>
-          <w:ilvl w:val="0"/>
-          <w:numId w:val="7"/>
-        </w:numPr>
-        <w:jc w:val="both"/>
-      </w:pPr>
-      <w:r>
-        <w:rPr>
-          <w:i/>
-          <w:iCs/>
-        </w:rPr>
-        <w:t xml:space="preserve">Il sistema </w:t>
-      </w:r>
-      <w:r>
-        <w:rPr>
-          <w:i/>
-          <w:iCs/>
-        </w:rPr>
-        <w:t xml:space="preserve">deve offrire al Cliente una funzionalità per </w:t>
-      </w:r>
-      <w:r>
-        <w:rPr>
-          <w:i/>
-          <w:iCs/>
-        </w:rPr>
-        <w:t>prenotare un’auto.</w:t>
-      </w:r>
-    </w:p>
-    <w:p>
-      <w:pPr>
-        <w:pStyle w:val="Paragrafoelenco"/>
-        <w:numPr>
-          <w:ilvl w:val="0"/>
-          <w:numId w:val="7"/>
-        </w:numPr>
-        <w:jc w:val="both"/>
-      </w:pPr>
-      <w:r>
-        <w:rPr>
-          <w:i/>
-          <w:iCs/>
-        </w:rPr>
-        <w:t>I</w:t>
-      </w:r>
-      <w:r>
-        <w:rPr>
-          <w:i/>
-          <w:iCs/>
-        </w:rPr>
-        <w:t>l</w:t>
-      </w:r>
-      <w:r>
-        <w:rPr>
-          <w:i/>
-          <w:iCs/>
-        </w:rPr>
-        <w:t xml:space="preserve"> </w:t>
-      </w:r>
-      <w:r>
-        <w:rPr>
-          <w:i/>
-          <w:iCs/>
-        </w:rPr>
-        <w:t>C</w:t>
-      </w:r>
-      <w:r>
-        <w:rPr>
-          <w:i/>
-          <w:iCs/>
-        </w:rPr>
-        <w:t>lient</w:t>
-      </w:r>
-      <w:r>
-        <w:rPr>
-          <w:i/>
-          <w:iCs/>
-        </w:rPr>
-        <w:t>e</w:t>
-      </w:r>
-      <w:r>
-        <w:rPr>
-          <w:i/>
-          <w:iCs/>
-        </w:rPr>
-        <w:t xml:space="preserve">, per prenotare un </w:t>
-      </w:r>
-      <w:r>
-        <w:rPr>
-          <w:i/>
-          <w:iCs/>
-        </w:rPr>
-        <w:t>N</w:t>
-      </w:r>
-      <w:r>
-        <w:rPr>
-          <w:i/>
-          <w:iCs/>
-        </w:rPr>
-        <w:t xml:space="preserve">oleggio, </w:t>
-      </w:r>
-      <w:r>
-        <w:rPr>
-          <w:i/>
-          <w:iCs/>
-        </w:rPr>
-        <w:t>deve</w:t>
-      </w:r>
-      <w:r>
-        <w:rPr>
-          <w:i/>
-          <w:iCs/>
-        </w:rPr>
-        <w:t xml:space="preserve"> specificare data e ora di inizio e fine.</w:t>
-      </w:r>
-    </w:p>
-    <w:p>
-      <w:pPr>
-        <w:pStyle w:val="Paragrafoelenco"/>
-        <w:numPr>
-          <w:ilvl w:val="0"/>
-          <w:numId w:val="7"/>
-        </w:numPr>
-        <w:jc w:val="both"/>
-      </w:pPr>
-      <w:r>
-        <w:rPr>
-          <w:i/>
-          <w:iCs/>
-        </w:rPr>
-        <w:t>Il</w:t>
-      </w:r>
-      <w:r>
-        <w:rPr>
-          <w:i/>
-          <w:iCs/>
-        </w:rPr>
-        <w:t xml:space="preserve"> sistema deve inviare un messaggio di conferma al </w:t>
-      </w:r>
-      <w:r>
-        <w:rPr>
-          <w:i/>
-          <w:iCs/>
-        </w:rPr>
-        <w:t>C</w:t>
-      </w:r>
-      <w:r>
-        <w:rPr>
-          <w:i/>
-          <w:iCs/>
-        </w:rPr>
-        <w:t>liente</w:t>
-      </w:r>
-      <w:r>
-        <w:rPr>
-          <w:i/>
-          <w:iCs/>
-        </w:rPr>
-        <w:t>, dopo una prenotazione</w:t>
-      </w:r>
-      <w:r>
-        <w:rPr>
-          <w:i/>
-          <w:iCs/>
-        </w:rPr>
-        <w:t xml:space="preserve">. </w:t>
-      </w:r>
-    </w:p>
-    <w:p>
-      <w:pPr>
-        <w:pStyle w:val="Paragrafoelenco"/>
-        <w:numPr>
-          <w:ilvl w:val="0"/>
-          <w:numId w:val="7"/>
-        </w:numPr>
-        <w:jc w:val="both"/>
-        <w:rPr>
-          <w:i/>
-          <w:iCs/>
-        </w:rPr>
-      </w:pPr>
-      <w:r>
-        <w:rPr>
-          <w:i/>
-          <w:iCs/>
-        </w:rPr>
-        <w:t>I</w:t>
-      </w:r>
-      <w:r>
-        <w:rPr>
-          <w:i/>
-          <w:iCs/>
-        </w:rPr>
-        <w:t xml:space="preserve">l sistema </w:t>
-      </w:r>
-      <w:r>
-        <w:rPr>
-          <w:i/>
-          <w:iCs/>
-        </w:rPr>
-        <w:t>deve</w:t>
-      </w:r>
-      <w:r>
-        <w:rPr>
-          <w:i/>
-          <w:iCs/>
-        </w:rPr>
-        <w:t xml:space="preserve"> verificare la corrispondenza tra la patente del </w:t>
-      </w:r>
-      <w:r>
-        <w:rPr>
-          <w:i/>
-          <w:iCs/>
-        </w:rPr>
-        <w:t>C</w:t>
-      </w:r>
-      <w:r>
-        <w:rPr>
-          <w:i/>
-          <w:iCs/>
-        </w:rPr>
-        <w:t>liente e il tipo di veicolo selezionato per assicurare che il cliente sia abilitato alla guida di quel veicolo</w:t>
-      </w:r>
-      <w:r>
-        <w:rPr>
-          <w:i/>
-          <w:iCs/>
-        </w:rPr>
-        <w:t>.</w:t>
-      </w:r>
-    </w:p>
-    <w:p>
-      <w:pPr>
-        <w:pStyle w:val="Paragrafoelenco"/>
-        <w:numPr>
-          <w:ilvl w:val="0"/>
-          <w:numId w:val="7"/>
-        </w:numPr>
-        <w:jc w:val="both"/>
-        <w:rPr>
-          <w:i/>
-          <w:iCs/>
-        </w:rPr>
-      </w:pPr>
-      <w:r>
-        <w:rPr>
-          <w:i/>
-          <w:iCs/>
-        </w:rPr>
-        <w:t>XXX</w:t>
-      </w:r>
-    </w:p>
-    <w:p>
-      <w:pPr>
-        <w:pStyle w:val="Paragrafoelenco"/>
-        <w:numPr>
-          <w:ilvl w:val="0"/>
-          <w:numId w:val="7"/>
-        </w:numPr>
-        <w:jc w:val="both"/>
-        <w:rPr>
-          <w:i/>
-          <w:iCs/>
-        </w:rPr>
-      </w:pPr>
-      <w:r>
-        <w:rPr>
-          <w:i/>
-          <w:iCs/>
-        </w:rPr>
-        <w:t>……</w:t>
-      </w:r>
-    </w:p>
-    <w:p>
-      <w:pPr>
-        <w:pStyle w:val="Paragrafoelenco"/>
-        <w:numPr>
-          <w:ilvl w:val="0"/>
-          <w:numId w:val="7"/>
-        </w:numPr>
-        <w:jc w:val="both"/>
-        <w:rPr>
-          <w:i/>
-          <w:iCs/>
-        </w:rPr>
-      </w:pPr>
-      <w:r>
-        <w:rPr>
-          <w:i/>
-          <w:iCs/>
-        </w:rPr>
-        <w:t>…….</w:t>
-      </w:r>
-    </w:p>
-    <w:p>
+      </w:pPr>
       <w:bookmarkStart w:id="16" w:name="_Toc471222551"/>
       <w:bookmarkStart w:id="17" w:name="_Toc471222590"/>
       <w:bookmarkStart w:id="18" w:name="_Toc471224120"/>
@@ -4985,8 +4971,489 @@
       <w:bookmarkStart w:id="20" w:name="_Toc471905546"/>
       <w:bookmarkStart w:id="21" w:name="_Toc474433548"/>
       <w:bookmarkStart w:id="22" w:name="_Toc474433723"/>
-    </w:p>
-    <w:p/>
+      <w:r>
+        <w:t>I</w:t>
+      </w:r>
+      <w:r>
+        <w:t>l sistema deve offrire all’Utente una funzionalità per registrarsi tramite credenziali personali</w:t>
+      </w:r>
+      <w:r>
+        <w:t xml:space="preserve"> (</w:t>
+      </w:r>
+      <w:r>
+        <w:t xml:space="preserve">nome, cognome ed </w:t>
+      </w:r>
+      <w:r>
+        <w:t>e-mail</w:t>
+      </w:r>
+      <w:r>
+        <w:t>).</w:t>
+      </w:r>
+    </w:p>
+    <w:p>
+      <w:pPr>
+        <w:pStyle w:val="Paragrafoelenco"/>
+        <w:numPr>
+          <w:ilvl w:val="0"/>
+          <w:numId w:val="99"/>
+        </w:numPr>
+      </w:pPr>
+      <w:r>
+        <w:t>l’utente, In</w:t>
+      </w:r>
+      <w:r>
+        <w:t xml:space="preserve"> fase di registrazione, </w:t>
+      </w:r>
+      <w:r>
+        <w:t>deve poter specificare il proprio ruolo (atleta o allenatore)</w:t>
+      </w:r>
+      <w:r>
+        <w:t>.</w:t>
+      </w:r>
+    </w:p>
+    <w:p>
+      <w:pPr>
+        <w:pStyle w:val="Paragrafoelenco"/>
+        <w:numPr>
+          <w:ilvl w:val="0"/>
+          <w:numId w:val="99"/>
+        </w:numPr>
+      </w:pPr>
+      <w:r>
+        <w:t>Il sistema</w:t>
+      </w:r>
+      <w:r>
+        <w:t xml:space="preserve"> deve memorizzare</w:t>
+      </w:r>
+      <w:r>
+        <w:t>, oltre ai dati anagrafici, l'eventuale disciplina sportiva prevalente.</w:t>
+      </w:r>
+    </w:p>
+    <w:p>
+      <w:pPr>
+        <w:pStyle w:val="Paragrafoelenco"/>
+        <w:numPr>
+          <w:ilvl w:val="0"/>
+          <w:numId w:val="99"/>
+        </w:numPr>
+      </w:pPr>
+      <w:r>
+        <w:t>Il sistema deve offrire all’Allenatore una funzionalità per creare e gestire il profilo di uno o più atleti associati.</w:t>
+      </w:r>
+    </w:p>
+    <w:p>
+      <w:pPr>
+        <w:pStyle w:val="Paragrafoelenco"/>
+        <w:numPr>
+          <w:ilvl w:val="0"/>
+          <w:numId w:val="99"/>
+        </w:numPr>
+      </w:pPr>
+      <w:r>
+        <w:t xml:space="preserve">Il sistema </w:t>
+      </w:r>
+      <w:r>
+        <w:t xml:space="preserve">deve permettere all’ </w:t>
+      </w:r>
+      <w:r>
+        <w:t xml:space="preserve">Allenatore </w:t>
+      </w:r>
+      <w:r>
+        <w:t>di associare al proprio profilo</w:t>
+      </w:r>
+      <w:r>
+        <w:t xml:space="preserve"> uno o pi</w:t>
+      </w:r>
+      <w:r>
+        <w:t>ù</w:t>
+      </w:r>
+      <w:r>
+        <w:t xml:space="preserve"> atleti</w:t>
+      </w:r>
+      <w:r>
+        <w:t xml:space="preserve"> (metodo diretto)</w:t>
+      </w:r>
+    </w:p>
+    <w:p>
+      <w:pPr>
+        <w:pStyle w:val="Paragrafoelenco"/>
+        <w:numPr>
+          <w:ilvl w:val="0"/>
+          <w:numId w:val="99"/>
+        </w:numPr>
+      </w:pPr>
+      <w:r>
+        <w:t xml:space="preserve">Il sistema deve </w:t>
+      </w:r>
+      <w:r>
+        <w:t xml:space="preserve">fornire all’ utente un codice univoco per poter associare il suo profilo </w:t>
+      </w:r>
+      <w:r>
+        <w:t>al profilo di un allenatore (in alternativa al metodo diretto)</w:t>
+      </w:r>
+    </w:p>
+    <w:p>
+      <w:pPr>
+        <w:pStyle w:val="Paragrafoelenco"/>
+        <w:numPr>
+          <w:ilvl w:val="0"/>
+          <w:numId w:val="99"/>
+        </w:numPr>
+      </w:pPr>
+      <w:r>
+        <w:t>Di ogni Atleta si vuole memorizzare disciplina praticata, livello di esperienza ed eventuali obiettivi sportivi.</w:t>
+      </w:r>
+    </w:p>
+    <w:p>
+      <w:pPr>
+        <w:pStyle w:val="Paragrafoelenco"/>
+        <w:numPr>
+          <w:ilvl w:val="0"/>
+          <w:numId w:val="99"/>
+        </w:numPr>
+      </w:pPr>
+      <w:r>
+        <w:t>Il sistema deve offrire all’Allenatore una funzionalità per creare sessioni di allenamento personalizzate, specificando titolo, descrizione, data e durata prevista.</w:t>
+      </w:r>
+    </w:p>
+    <w:p>
+      <w:pPr>
+        <w:pStyle w:val="Paragrafoelenco"/>
+        <w:numPr>
+          <w:ilvl w:val="0"/>
+          <w:numId w:val="99"/>
+        </w:numPr>
+      </w:pPr>
+      <w:r>
+        <w:t>Il sistema</w:t>
+      </w:r>
+      <w:r>
+        <w:t xml:space="preserve"> memorizza per</w:t>
+      </w:r>
+      <w:r>
+        <w:t xml:space="preserve"> ogni </w:t>
+      </w:r>
+      <w:r>
+        <w:t>s</w:t>
+      </w:r>
+      <w:r>
+        <w:t>essione l'elenco degli esercizi, ciascuno caratterizzato da nome, descrizione e parametri previsti (ripetizioni o durata).</w:t>
+      </w:r>
+    </w:p>
+    <w:p>
+      <w:pPr>
+        <w:pStyle w:val="Paragrafoelenco"/>
+        <w:numPr>
+          <w:ilvl w:val="0"/>
+          <w:numId w:val="99"/>
+        </w:numPr>
+      </w:pPr>
+      <w:r>
+        <w:t>Il sistema deve offrire all'Atleta una funzionalità per visualizzare l'elenco delle proprie sessioni assegnate, ordinate cronologicamente.</w:t>
+      </w:r>
+    </w:p>
+    <w:p>
+      <w:pPr>
+        <w:pStyle w:val="Paragrafoelenco"/>
+        <w:numPr>
+          <w:ilvl w:val="0"/>
+          <w:numId w:val="99"/>
+        </w:numPr>
+      </w:pPr>
+      <w:r>
+        <w:t>Il sistema deve offrire all'Atleta una funzionalità per registrare i risultati effettivamente ottenuti (ripetizioni, tempi o note testuali) per ogni esercizio svolto.</w:t>
+      </w:r>
+    </w:p>
+    <w:p>
+      <w:pPr>
+        <w:pStyle w:val="Paragrafoelenco"/>
+        <w:numPr>
+          <w:ilvl w:val="0"/>
+          <w:numId w:val="99"/>
+        </w:numPr>
+      </w:pPr>
+      <w:r>
+        <w:t>Il sistema deve gestire lo stato di ogni sessione, permettendo il passaggio tra gli stati: "assegnata", "in corso" e "completata".</w:t>
+      </w:r>
+    </w:p>
+    <w:p>
+      <w:pPr>
+        <w:pStyle w:val="NormaleWeb"/>
+        <w:numPr>
+          <w:ilvl w:val="0"/>
+          <w:numId w:val="99"/>
+        </w:numPr>
+      </w:pPr>
+      <w:r>
+        <w:t>Il sistema deve offrire all’Allenatore una funzionalità per visualizzare l'elenco cronologico (lo storico) di tutte le sessioni di allenamento passate per ogni singolo atleta a lui associato.</w:t>
+      </w:r>
+    </w:p>
+    <w:p>
+      <w:pPr>
+        <w:pStyle w:val="NormaleWeb"/>
+        <w:numPr>
+          <w:ilvl w:val="0"/>
+          <w:numId w:val="99"/>
+        </w:numPr>
+      </w:pPr>
+      <w:r>
+        <w:t>Il sistema deve mostrare all'Allenatore, per ogni sessione nello storico, sia i parametri dell'allenamento originariamente assegnato (es. ripetizioni/tempi previsti) sia i risultati reali registrati dall'atleta.</w:t>
+      </w:r>
+    </w:p>
+    <w:p>
+      <w:pPr>
+        <w:pStyle w:val="NormaleWeb"/>
+        <w:numPr>
+          <w:ilvl w:val="0"/>
+          <w:numId w:val="99"/>
+        </w:numPr>
+      </w:pPr>
+      <w:r>
+        <w:t>Il sistema deve permettere all'Allenatore di selezionare una singola sessione dallo storico per aprirne il dettaglio completo (es. singoli esercizi, note inserite, parametri specifici).</w:t>
+      </w:r>
+    </w:p>
+    <w:p>
+      <w:pPr>
+        <w:pStyle w:val="NormaleWeb"/>
+        <w:numPr>
+          <w:ilvl w:val="0"/>
+          <w:numId w:val="99"/>
+        </w:numPr>
+      </w:pPr>
+      <w:r>
+        <w:t>Il sistema deve fornire all'Allenatore una funzionalità per analizzare l'evoluzione e la progressione delle prestazioni dell'atleta nel corso del tempo</w:t>
+      </w:r>
+      <w:r>
+        <w:t>.</w:t>
+      </w:r>
+    </w:p>
+    <w:p>
+      <w:pPr>
+        <w:pStyle w:val="Paragrafoelenco"/>
+        <w:numPr>
+          <w:ilvl w:val="0"/>
+          <w:numId w:val="99"/>
+        </w:numPr>
+      </w:pPr>
+      <w:r>
+        <w:t>Il sistema deve offrire all'Atleta una sezione profilo per consultare il totale degli allenamenti completati e l'elenco delle sessioni future.</w:t>
+      </w:r>
+    </w:p>
+    <w:p>
+      <w:pPr>
+        <w:pStyle w:val="Paragrafoelenco"/>
+        <w:numPr>
+          <w:ilvl w:val="0"/>
+          <w:numId w:val="99"/>
+        </w:numPr>
+      </w:pPr>
+      <w:r>
+        <w:t xml:space="preserve">Il sistema deve offrire all'Allenatore un'interfaccia </w:t>
+      </w:r>
+      <w:r>
+        <w:t>dedicata</w:t>
+      </w:r>
+      <w:r>
+        <w:t xml:space="preserve"> </w:t>
+      </w:r>
+      <w:r>
+        <w:t>per</w:t>
+      </w:r>
+      <w:r>
+        <w:t xml:space="preserve"> monitorare il numero di sessioni assegnate/completate e indicatori sulla continuità degli allenamenti dei propri atleti</w:t>
+      </w:r>
+      <w:r>
+        <w:t>.</w:t>
+      </w:r>
+    </w:p>
+    <w:p>
+      <w:pPr>
+        <w:pStyle w:val="Paragrafoelenco"/>
+        <w:numPr>
+          <w:ilvl w:val="0"/>
+          <w:numId w:val="99"/>
+        </w:numPr>
+      </w:pPr>
+      <w:r>
+        <w:t xml:space="preserve">Il </w:t>
+      </w:r>
+      <w:r>
+        <w:t>sistema deve</w:t>
+      </w:r>
+      <w:r>
+        <w:t xml:space="preserve"> permette all</w:t>
+      </w:r>
+      <w:r>
+        <w:t>’</w:t>
+      </w:r>
+      <w:r>
+        <w:t xml:space="preserve"> allenatore di selezionare un singolo atleta</w:t>
+      </w:r>
+      <w:r>
+        <w:t xml:space="preserve"> dall’ interfaccia dedicata (</w:t>
+      </w:r>
+      <w:r>
+        <w:t>punto 18</w:t>
+      </w:r>
+      <w:r>
+        <w:t>) per</w:t>
+      </w:r>
+      <w:r>
+        <w:t xml:space="preserve"> </w:t>
+      </w:r>
+      <w:r>
+        <w:t xml:space="preserve"> </w:t>
+      </w:r>
+      <w:r>
+        <w:t xml:space="preserve"> </w:t>
+      </w:r>
+      <w:r>
+        <w:t>visualizzarne</w:t>
+      </w:r>
+      <w:r>
+        <w:t xml:space="preserve"> il profilo sportivo, comprensivo delle informazioni anagrafiche essenziali</w:t>
+      </w:r>
+      <w:r>
+        <w:t>,</w:t>
+      </w:r>
+      <w:r>
+        <w:t xml:space="preserve"> della disciplina praticata e degli obiettivi assegnati.</w:t>
+      </w:r>
+    </w:p>
+    <w:p>
+      <w:pPr>
+        <w:pStyle w:val="Paragrafoelenco"/>
+        <w:numPr>
+          <w:ilvl w:val="0"/>
+          <w:numId w:val="99"/>
+        </w:numPr>
+      </w:pPr>
+      <w:r>
+        <w:t>Il sistema deve offrire funzionalità di ricerca e filtraggio delle sessioni per data, disciplina o stato.</w:t>
+      </w:r>
+    </w:p>
+    <w:p>
+      <w:pPr>
+        <w:pStyle w:val="Paragrafoelenco"/>
+        <w:numPr>
+          <w:ilvl w:val="0"/>
+          <w:numId w:val="99"/>
+        </w:numPr>
+      </w:pPr>
+      <w:r>
+        <w:t>Il sistema deve inviare una notifica all’Atleta all'assegnazione di un nuovo allenamento e all'Allenatore al completamento di una sessione.</w:t>
+      </w:r>
+    </w:p>
+    <w:p>
+      <w:pPr>
+        <w:pStyle w:val="Paragrafoelenco"/>
+        <w:numPr>
+          <w:ilvl w:val="0"/>
+          <w:numId w:val="99"/>
+        </w:numPr>
+      </w:pPr>
+      <w:r>
+        <w:t>Il sistema deve garantire la protezione dei dati personali e il controllo dei permessi di accesso in base al ruolo</w:t>
+      </w:r>
+      <w:r>
+        <w:t>.</w:t>
+      </w:r>
+    </w:p>
+    <w:p>
+      <w:pPr>
+        <w:pStyle w:val="Paragrafoelenco"/>
+        <w:numPr>
+          <w:ilvl w:val="0"/>
+          <w:numId w:val="99"/>
+        </w:numPr>
+      </w:pPr>
+      <w:r>
+        <w:lastRenderedPageBreak/>
+        <w:t>Il sistema</w:t>
+      </w:r>
+      <w:r>
+        <w:t xml:space="preserve"> deve essere intuitiv</w:t>
+      </w:r>
+      <w:r>
+        <w:t>o</w:t>
+      </w:r>
+      <w:r>
+        <w:t xml:space="preserve"> e responsiv</w:t>
+      </w:r>
+      <w:r>
+        <w:t>o</w:t>
+      </w:r>
+      <w:r>
+        <w:t xml:space="preserve"> per</w:t>
+      </w:r>
+      <w:r>
+        <w:t xml:space="preserve"> l</w:t>
+      </w:r>
+      <w:r>
+        <w:t>’utilizzo</w:t>
+      </w:r>
+    </w:p>
+    <w:p>
+      <w:pPr>
+        <w:numPr>
+          <w:ilvl w:val="0"/>
+          <w:numId w:val="99"/>
+        </w:numPr>
+        <w:spacing w:after="160" w:line="278" w:lineRule="auto"/>
+      </w:pPr>
+      <w:r>
+        <w:t xml:space="preserve">Il sistema deve essere </w:t>
+      </w:r>
+      <w:r>
+        <w:t>muti</w:t>
+      </w:r>
+      <w:r>
+        <w:t>-</w:t>
+      </w:r>
+      <w:r>
+        <w:rPr>
+          <w:u w:val="single"/>
+        </w:rPr>
+        <w:t>piatt</w:t>
+      </w:r>
+      <w:r>
+        <w:rPr>
+          <w:u w:val="single"/>
+        </w:rPr>
+        <w:t>aforma</w:t>
+      </w:r>
+      <w:r>
+        <w:t xml:space="preserve">, </w:t>
+      </w:r>
+      <w:r>
+        <w:t>accessibile</w:t>
+      </w:r>
+      <w:r>
+        <w:t xml:space="preserve"> </w:t>
+      </w:r>
+      <w:r>
+        <w:t>via web</w:t>
+      </w:r>
+      <w:r>
+        <w:t>,</w:t>
+      </w:r>
+      <w:r>
+        <w:t xml:space="preserve"> </w:t>
+      </w:r>
+      <w:r>
+        <w:t xml:space="preserve">da </w:t>
+      </w:r>
+      <w:r>
+        <w:t xml:space="preserve">desktop che da mobile. </w:t>
+      </w:r>
+    </w:p>
+    <w:p>
+      <w:pPr>
+        <w:rPr>
+          <w:u w:val="single"/>
+        </w:rPr>
+      </w:pPr>
+    </w:p>
     <w:p>
       <w:pPr>
         <w:pStyle w:val="Titolo2"/>
@@ -5488,7 +5955,6 @@
       <w:bookmarkStart w:id="29" w:name="_Toc474433724"/>
       <w:bookmarkStart w:id="30" w:name="_Toc195300118"/>
       <w:r>
-        <w:lastRenderedPageBreak/>
         <w:t>Classificazione dei requisiti</w:t>
       </w:r>
       <w:bookmarkEnd w:id="24"/>
@@ -6297,6 +6763,7 @@
       <w:bookmarkStart w:id="41" w:name="_Toc474433726"/>
       <w:bookmarkStart w:id="42" w:name="_Toc195300120"/>
       <w:r>
+        <w:lastRenderedPageBreak/>
         <w:t xml:space="preserve">Requisiti </w:t>
       </w:r>
       <w:r>
@@ -6798,30 +7265,21 @@
                 <w:rFonts w:ascii="Times New Roman" w:eastAsia="Times New Roman" w:hAnsi="Times New Roman" w:cs="Times New Roman"/>
                 <w:color w:val="000000"/>
               </w:rPr>
-              <w:t xml:space="preserve">Il sistema deve mostrare le auto </w:t>
-            </w:r>
+              <w:t>Il sistema deve mostrare le auto disponibili rapidamente</w:t>
+            </w:r>
+          </w:p>
+        </w:tc>
+        <w:tc>
+          <w:tcPr>
+            <w:tcW w:w="1604" w:type="dxa"/>
+            <w:vAlign w:val="center"/>
+          </w:tcPr>
+          <w:p>
             <w:r>
               <w:rPr>
                 <w:rFonts w:ascii="Times New Roman" w:eastAsia="Times New Roman" w:hAnsi="Times New Roman" w:cs="Times New Roman"/>
                 <w:color w:val="000000"/>
               </w:rPr>
-              <w:lastRenderedPageBreak/>
-              <w:t>disponibili rapidamente</w:t>
-            </w:r>
-          </w:p>
-        </w:tc>
-        <w:tc>
-          <w:tcPr>
-            <w:tcW w:w="1604" w:type="dxa"/>
-            <w:vAlign w:val="center"/>
-          </w:tcPr>
-          <w:p>
-            <w:r>
-              <w:rPr>
-                <w:rFonts w:ascii="Times New Roman" w:eastAsia="Times New Roman" w:hAnsi="Times New Roman" w:cs="Times New Roman"/>
-                <w:color w:val="000000"/>
-              </w:rPr>
-              <w:lastRenderedPageBreak/>
               <w:t>Tempo di risposta</w:t>
             </w:r>
           </w:p>
@@ -25745,9 +26203,9 @@
             </wp:anchor>
           </w:drawing>
         </mc:Choice>
-        <mc:Fallback xmlns:arto="http://schemas.microsoft.com/office/word/2006/arto">
+        <mc:Fallback>
           <w:pict>
-            <v:line w14:anchorId="3D5DA729" id="Connettore 1 6" o:spid="_x0000_s1026" style="position:absolute;z-index:251659264;visibility:visible;mso-wrap-style:square;mso-width-percent:0;mso-height-percent:0;mso-wrap-distance-left:9pt;mso-wrap-distance-top:0;mso-wrap-distance-right:9pt;mso-wrap-distance-bottom:0;mso-position-horizontal:absolute;mso-position-horizontal-relative:text;mso-position-vertical:absolute;mso-position-vertical-relative:text;mso-width-percent:0;mso-height-percent:0;mso-width-relative:margin;mso-height-relative:margin" from="-4.45pt,-2.35pt" to="483.7pt,-2.35pt" o:gfxdata="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" strokecolor="#659ed5" strokeweight="1.5pt"/>
+            <v:line w14:anchorId="09E61E8B" id="Connettore 1 6" o:spid="_x0000_s1026" style="position:absolute;z-index:251658240;visibility:visible;mso-wrap-style:square;mso-width-percent:0;mso-height-percent:0;mso-wrap-distance-left:9pt;mso-wrap-distance-top:0;mso-wrap-distance-right:9pt;mso-wrap-distance-bottom:0;mso-position-horizontal:absolute;mso-position-horizontal-relative:text;mso-position-vertical:absolute;mso-position-vertical-relative:text;mso-width-percent:0;mso-height-percent:0;mso-width-relative:margin;mso-height-relative:margin" from="-4.45pt,-2.35pt" to="483.7pt,-2.35pt" o:gfxdata="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" strokecolor="#659ed5" strokeweight="1.5pt"/>
           </w:pict>
         </mc:Fallback>
       </mc:AlternateContent>
@@ -25791,6 +26249,11 @@
         <w:docPartUnique/>
       </w:docPartObj>
     </w:sdtPr>
+    <w:sdtEndPr>
+      <w:rPr>
+        <w:rStyle w:val="Numeropagina"/>
+      </w:rPr>
+    </w:sdtEndPr>
     <w:sdtContent>
       <w:p>
         <w:pPr>
@@ -25903,9 +26366,9 @@
             </wp:anchor>
           </w:drawing>
         </mc:Choice>
-        <mc:Fallback xmlns:arto="http://schemas.microsoft.com/office/word/2006/arto">
+        <mc:Fallback>
           <w:pict>
-            <v:line w14:anchorId="6EBEDD08" id="Connettore 1 6" o:spid="_x0000_s1026" style="position:absolute;z-index:251661312;visibility:visible;mso-wrap-style:square;mso-width-percent:0;mso-height-percent:0;mso-wrap-distance-left:9pt;mso-wrap-distance-top:0;mso-wrap-distance-right:9pt;mso-wrap-distance-bottom:0;mso-position-horizontal:absolute;mso-position-horizontal-relative:text;mso-position-vertical:absolute;mso-position-vertical-relative:text;mso-width-percent:0;mso-height-percent:0;mso-width-relative:margin;mso-height-relative:margin" from="-4.6pt,-3.35pt" to="485.95pt,-3.35pt" o:gfxdata="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" strokecolor="#659ed5" strokeweight="1.5pt"/>
+            <v:line w14:anchorId="77AB465F" id="Connettore 1 6" o:spid="_x0000_s1026" style="position:absolute;z-index:251658241;visibility:visible;mso-wrap-style:square;mso-width-percent:0;mso-height-percent:0;mso-wrap-distance-left:9pt;mso-wrap-distance-top:0;mso-wrap-distance-right:9pt;mso-wrap-distance-bottom:0;mso-position-horizontal:absolute;mso-position-horizontal-relative:text;mso-position-vertical:absolute;mso-position-vertical-relative:text;mso-width-percent:0;mso-height-percent:0;mso-width-relative:margin;mso-height-relative:margin" from="-4.6pt,-3.35pt" to="485.95pt,-3.35pt" o:gfxdata="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" strokecolor="#659ed5" strokeweight="1.5pt"/>
           </w:pict>
         </mc:Fallback>
       </mc:AlternateContent>
@@ -26005,6 +26468,11 @@
         <w:docPartUnique/>
       </w:docPartObj>
     </w:sdtPr>
+    <w:sdtEndPr>
+      <w:rPr>
+        <w:rStyle w:val="Numeropagina"/>
+      </w:rPr>
+    </w:sdtEndPr>
     <w:sdtContent>
       <w:p>
         <w:pPr>
@@ -26117,9 +26585,9 @@
             </wp:anchor>
           </w:drawing>
         </mc:Choice>
-        <mc:Fallback xmlns:arto="http://schemas.microsoft.com/office/word/2006/arto">
+        <mc:Fallback>
           <w:pict>
-            <v:line w14:anchorId="592E0DAD" id="Connettore 1 6" o:spid="_x0000_s1026" style="position:absolute;z-index:251664384;visibility:visible;mso-wrap-style:square;mso-width-percent:0;mso-height-percent:0;mso-wrap-distance-left:9pt;mso-wrap-distance-top:0;mso-wrap-distance-right:9pt;mso-wrap-distance-bottom:0;mso-position-horizontal:absolute;mso-position-horizontal-relative:text;mso-position-vertical:absolute;mso-position-vertical-relative:text;mso-width-percent:0;mso-height-percent:0;mso-width-relative:margin;mso-height-relative:margin" from="-4.85pt,-3.05pt" to="706.15pt,-3.05pt" o:gfxdata="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" strokecolor="#659ed5" strokeweight="1.5pt"/>
+            <v:line w14:anchorId="0B6A3642" id="Connettore 1 6" o:spid="_x0000_s1026" style="position:absolute;z-index:251658243;visibility:visible;mso-wrap-style:square;mso-width-percent:0;mso-height-percent:0;mso-wrap-distance-left:9pt;mso-wrap-distance-top:0;mso-wrap-distance-right:9pt;mso-wrap-distance-bottom:0;mso-position-horizontal:absolute;mso-position-horizontal-relative:text;mso-position-vertical:absolute;mso-position-vertical-relative:text;mso-width-percent:0;mso-height-percent:0;mso-width-relative:margin;mso-height-relative:margin" from="-4.85pt,-3.05pt" to="706.15pt,-3.05pt" o:gfxdata="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" strokecolor="#659ed5" strokeweight="1.5pt"/>
           </w:pict>
         </mc:Fallback>
       </mc:AlternateContent>
@@ -30460,6 +30928,92 @@
     </w:lvl>
   </w:abstractNum>
   <w:abstractNum w:abstractNumId="37" w15:restartNumberingAfterBreak="0">
+    <w:nsid w:val="2AC73E67"/>
+    <w:multiLevelType w:val="hybridMultilevel"/>
+    <w:tmpl w:val="70A87B46"/>
+    <w:lvl w:ilvl="0" w:tplc="0410000F">
+      <w:start w:val="1"/>
+      <w:numFmt w:val="decimal"/>
+      <w:lvlText w:val="%1."/>
+      <w:lvlJc w:val="left"/>
+      <w:pPr>
+        <w:ind w:left="720" w:hanging="360"/>
+      </w:pPr>
+    </w:lvl>
+    <w:lvl w:ilvl="1" w:tplc="04100019" w:tentative="1">
+      <w:start w:val="1"/>
+      <w:numFmt w:val="lowerLetter"/>
+      <w:lvlText w:val="%2."/>
+      <w:lvlJc w:val="left"/>
+      <w:pPr>
+        <w:ind w:left="1440" w:hanging="360"/>
+      </w:pPr>
+    </w:lvl>
+    <w:lvl w:ilvl="2" w:tplc="0410001B" w:tentative="1">
+      <w:start w:val="1"/>
+      <w:numFmt w:val="lowerRoman"/>
+      <w:lvlText w:val="%3."/>
+      <w:lvlJc w:val="right"/>
+      <w:pPr>
+        <w:ind w:left="2160" w:hanging="180"/>
+      </w:pPr>
+    </w:lvl>
+    <w:lvl w:ilvl="3" w:tplc="0410000F" w:tentative="1">
+      <w:start w:val="1"/>
+      <w:numFmt w:val="decimal"/>
+      <w:lvlText w:val="%4."/>
+      <w:lvlJc w:val="left"/>
+      <w:pPr>
+        <w:ind w:left="2880" w:hanging="360"/>
+      </w:pPr>
+    </w:lvl>
+    <w:lvl w:ilvl="4" w:tplc="04100019" w:tentative="1">
+      <w:start w:val="1"/>
+      <w:numFmt w:val="lowerLetter"/>
+      <w:lvlText w:val="%5."/>
+      <w:lvlJc w:val="left"/>
+      <w:pPr>
+        <w:ind w:left="3600" w:hanging="360"/>
+      </w:pPr>
+    </w:lvl>
+    <w:lvl w:ilvl="5" w:tplc="0410001B" w:tentative="1">
+      <w:start w:val="1"/>
+      <w:numFmt w:val="lowerRoman"/>
+      <w:lvlText w:val="%6."/>
+      <w:lvlJc w:val="right"/>
+      <w:pPr>
+        <w:ind w:left="4320" w:hanging="180"/>
+      </w:pPr>
+    </w:lvl>
+    <w:lvl w:ilvl="6" w:tplc="0410000F" w:tentative="1">
+      <w:start w:val="1"/>
+      <w:numFmt w:val="decimal"/>
+      <w:lvlText w:val="%7."/>
+      <w:lvlJc w:val="left"/>
+      <w:pPr>
+        <w:ind w:left="5040" w:hanging="360"/>
+      </w:pPr>
+    </w:lvl>
+    <w:lvl w:ilvl="7" w:tplc="04100019" w:tentative="1">
+      <w:start w:val="1"/>
+      <w:numFmt w:val="lowerLetter"/>
+      <w:lvlText w:val="%8."/>
+      <w:lvlJc w:val="left"/>
+      <w:pPr>
+        <w:ind w:left="5760" w:hanging="360"/>
+      </w:pPr>
+    </w:lvl>
+    <w:lvl w:ilvl="8" w:tplc="0410001B" w:tentative="1">
+      <w:start w:val="1"/>
+      <w:numFmt w:val="lowerRoman"/>
+      <w:lvlText w:val="%9."/>
+      <w:lvlJc w:val="right"/>
+      <w:pPr>
+        <w:ind w:left="6480" w:hanging="180"/>
+      </w:pPr>
+    </w:lvl>
+  </w:abstractNum>
+  <w:abstractNum w:abstractNumId="38" w15:restartNumberingAfterBreak="0">
     <w:nsid w:val="2BE52D07"/>
     <w:multiLevelType w:val="hybridMultilevel"/>
     <w:tmpl w:val="23C6BBA6"/>
@@ -30572,7 +31126,7 @@
       </w:rPr>
     </w:lvl>
   </w:abstractNum>
-  <w:abstractNum w:abstractNumId="38" w15:restartNumberingAfterBreak="0">
+  <w:abstractNum w:abstractNumId="39" w15:restartNumberingAfterBreak="0">
     <w:nsid w:val="2BFC0F3A"/>
     <w:multiLevelType w:val="hybridMultilevel"/>
     <w:tmpl w:val="CBC28092"/>
@@ -30685,7 +31239,7 @@
       </w:rPr>
     </w:lvl>
   </w:abstractNum>
-  <w:abstractNum w:abstractNumId="39" w15:restartNumberingAfterBreak="0">
+  <w:abstractNum w:abstractNumId="40" w15:restartNumberingAfterBreak="0">
     <w:nsid w:val="2D5976EE"/>
     <w:multiLevelType w:val="hybridMultilevel"/>
     <w:tmpl w:val="B7C6DF82"/>
@@ -30798,7 +31352,7 @@
       </w:rPr>
     </w:lvl>
   </w:abstractNum>
-  <w:abstractNum w:abstractNumId="40" w15:restartNumberingAfterBreak="0">
+  <w:abstractNum w:abstractNumId="41" w15:restartNumberingAfterBreak="0">
     <w:nsid w:val="2DC4744D"/>
     <w:multiLevelType w:val="multilevel"/>
     <w:tmpl w:val="8290425C"/>
@@ -30888,7 +31442,7 @@
       </w:pPr>
     </w:lvl>
   </w:abstractNum>
-  <w:abstractNum w:abstractNumId="41" w15:restartNumberingAfterBreak="0">
+  <w:abstractNum w:abstractNumId="42" w15:restartNumberingAfterBreak="0">
     <w:nsid w:val="30061D84"/>
     <w:multiLevelType w:val="multilevel"/>
     <w:tmpl w:val="0410001F"/>
@@ -31003,7 +31557,7 @@
       </w:rPr>
     </w:lvl>
   </w:abstractNum>
-  <w:abstractNum w:abstractNumId="42" w15:restartNumberingAfterBreak="0">
+  <w:abstractNum w:abstractNumId="43" w15:restartNumberingAfterBreak="0">
     <w:nsid w:val="301A00C3"/>
     <w:multiLevelType w:val="hybridMultilevel"/>
     <w:tmpl w:val="E136763A"/>
@@ -31116,7 +31670,7 @@
       </w:rPr>
     </w:lvl>
   </w:abstractNum>
-  <w:abstractNum w:abstractNumId="43" w15:restartNumberingAfterBreak="0">
+  <w:abstractNum w:abstractNumId="44" w15:restartNumberingAfterBreak="0">
     <w:nsid w:val="3347590D"/>
     <w:multiLevelType w:val="hybridMultilevel"/>
     <w:tmpl w:val="D12C20EC"/>
@@ -31205,7 +31759,7 @@
       </w:pPr>
     </w:lvl>
   </w:abstractNum>
-  <w:abstractNum w:abstractNumId="44" w15:restartNumberingAfterBreak="0">
+  <w:abstractNum w:abstractNumId="45" w15:restartNumberingAfterBreak="0">
     <w:nsid w:val="38027184"/>
     <w:multiLevelType w:val="multilevel"/>
     <w:tmpl w:val="13B20C60"/>
@@ -31295,7 +31849,7 @@
       </w:pPr>
     </w:lvl>
   </w:abstractNum>
-  <w:abstractNum w:abstractNumId="45" w15:restartNumberingAfterBreak="0">
+  <w:abstractNum w:abstractNumId="46" w15:restartNumberingAfterBreak="0">
     <w:nsid w:val="38927A39"/>
     <w:multiLevelType w:val="hybridMultilevel"/>
     <w:tmpl w:val="BBAC650C"/>
@@ -31408,7 +31962,7 @@
       </w:rPr>
     </w:lvl>
   </w:abstractNum>
-  <w:abstractNum w:abstractNumId="46" w15:restartNumberingAfterBreak="0">
+  <w:abstractNum w:abstractNumId="47" w15:restartNumberingAfterBreak="0">
     <w:nsid w:val="39802A21"/>
     <w:multiLevelType w:val="multilevel"/>
     <w:tmpl w:val="E35ABA9A"/>
@@ -31498,7 +32052,7 @@
       </w:pPr>
     </w:lvl>
   </w:abstractNum>
-  <w:abstractNum w:abstractNumId="47" w15:restartNumberingAfterBreak="0">
+  <w:abstractNum w:abstractNumId="48" w15:restartNumberingAfterBreak="0">
     <w:nsid w:val="39CD3EF2"/>
     <w:multiLevelType w:val="multilevel"/>
     <w:tmpl w:val="0410001F"/>
@@ -31613,7 +32167,7 @@
       </w:rPr>
     </w:lvl>
   </w:abstractNum>
-  <w:abstractNum w:abstractNumId="48" w15:restartNumberingAfterBreak="0">
+  <w:abstractNum w:abstractNumId="49" w15:restartNumberingAfterBreak="0">
     <w:nsid w:val="3AB33181"/>
     <w:multiLevelType w:val="multilevel"/>
     <w:tmpl w:val="ED44EB66"/>
@@ -31703,7 +32257,7 @@
       </w:pPr>
     </w:lvl>
   </w:abstractNum>
-  <w:abstractNum w:abstractNumId="49" w15:restartNumberingAfterBreak="0">
+  <w:abstractNum w:abstractNumId="50" w15:restartNumberingAfterBreak="0">
     <w:nsid w:val="3D1B05EB"/>
     <w:multiLevelType w:val="hybridMultilevel"/>
     <w:tmpl w:val="10109194"/>
@@ -31792,7 +32346,7 @@
       </w:pPr>
     </w:lvl>
   </w:abstractNum>
-  <w:abstractNum w:abstractNumId="50" w15:restartNumberingAfterBreak="0">
+  <w:abstractNum w:abstractNumId="51" w15:restartNumberingAfterBreak="0">
     <w:nsid w:val="3DC74082"/>
     <w:multiLevelType w:val="multilevel"/>
     <w:tmpl w:val="9418DB06"/>
@@ -31937,7 +32491,7 @@
       </w:rPr>
     </w:lvl>
   </w:abstractNum>
-  <w:abstractNum w:abstractNumId="51" w15:restartNumberingAfterBreak="0">
+  <w:abstractNum w:abstractNumId="52" w15:restartNumberingAfterBreak="0">
     <w:nsid w:val="3DE83466"/>
     <w:multiLevelType w:val="multilevel"/>
     <w:tmpl w:val="4300B996"/>
@@ -32053,7 +32607,7 @@
       </w:rPr>
     </w:lvl>
   </w:abstractNum>
-  <w:abstractNum w:abstractNumId="52" w15:restartNumberingAfterBreak="0">
+  <w:abstractNum w:abstractNumId="53" w15:restartNumberingAfterBreak="0">
     <w:nsid w:val="3EC83E35"/>
     <w:multiLevelType w:val="hybridMultilevel"/>
     <w:tmpl w:val="783CFE40"/>
@@ -32166,7 +32720,7 @@
       </w:rPr>
     </w:lvl>
   </w:abstractNum>
-  <w:abstractNum w:abstractNumId="53" w15:restartNumberingAfterBreak="0">
+  <w:abstractNum w:abstractNumId="54" w15:restartNumberingAfterBreak="0">
     <w:nsid w:val="3ED37785"/>
     <w:multiLevelType w:val="hybridMultilevel"/>
     <w:tmpl w:val="7EECA278"/>
@@ -32255,7 +32809,7 @@
       </w:pPr>
     </w:lvl>
   </w:abstractNum>
-  <w:abstractNum w:abstractNumId="54" w15:restartNumberingAfterBreak="0">
+  <w:abstractNum w:abstractNumId="55" w15:restartNumberingAfterBreak="0">
     <w:nsid w:val="3EF46892"/>
     <w:multiLevelType w:val="multilevel"/>
     <w:tmpl w:val="0410001F"/>
@@ -32370,7 +32924,7 @@
       </w:rPr>
     </w:lvl>
   </w:abstractNum>
-  <w:abstractNum w:abstractNumId="55" w15:restartNumberingAfterBreak="0">
+  <w:abstractNum w:abstractNumId="56" w15:restartNumberingAfterBreak="0">
     <w:nsid w:val="3F142FA7"/>
     <w:multiLevelType w:val="hybridMultilevel"/>
     <w:tmpl w:val="9E3839F8"/>
@@ -32483,7 +33037,7 @@
       </w:rPr>
     </w:lvl>
   </w:abstractNum>
-  <w:abstractNum w:abstractNumId="56" w15:restartNumberingAfterBreak="0">
+  <w:abstractNum w:abstractNumId="57" w15:restartNumberingAfterBreak="0">
     <w:nsid w:val="3F32132A"/>
     <w:multiLevelType w:val="multilevel"/>
     <w:tmpl w:val="CE9CEE7E"/>
@@ -32599,7 +33153,7 @@
       </w:rPr>
     </w:lvl>
   </w:abstractNum>
-  <w:abstractNum w:abstractNumId="57" w15:restartNumberingAfterBreak="0">
+  <w:abstractNum w:abstractNumId="58" w15:restartNumberingAfterBreak="0">
     <w:nsid w:val="3F991084"/>
     <w:multiLevelType w:val="multilevel"/>
     <w:tmpl w:val="0410001F"/>
@@ -32715,7 +33269,7 @@
       </w:rPr>
     </w:lvl>
   </w:abstractNum>
-  <w:abstractNum w:abstractNumId="58" w15:restartNumberingAfterBreak="0">
+  <w:abstractNum w:abstractNumId="59" w15:restartNumberingAfterBreak="0">
     <w:nsid w:val="41D25CA7"/>
     <w:multiLevelType w:val="multilevel"/>
     <w:tmpl w:val="A9B07450"/>
@@ -32805,7 +33359,7 @@
       </w:pPr>
     </w:lvl>
   </w:abstractNum>
-  <w:abstractNum w:abstractNumId="59" w15:restartNumberingAfterBreak="0">
+  <w:abstractNum w:abstractNumId="60" w15:restartNumberingAfterBreak="0">
     <w:nsid w:val="43DC182D"/>
     <w:multiLevelType w:val="hybridMultilevel"/>
     <w:tmpl w:val="5146467C"/>
@@ -32918,7 +33472,7 @@
       </w:rPr>
     </w:lvl>
   </w:abstractNum>
-  <w:abstractNum w:abstractNumId="60" w15:restartNumberingAfterBreak="0">
+  <w:abstractNum w:abstractNumId="61" w15:restartNumberingAfterBreak="0">
     <w:nsid w:val="44A35B2C"/>
     <w:multiLevelType w:val="multilevel"/>
     <w:tmpl w:val="8E70F6E8"/>
@@ -33033,7 +33587,7 @@
       </w:rPr>
     </w:lvl>
   </w:abstractNum>
-  <w:abstractNum w:abstractNumId="61" w15:restartNumberingAfterBreak="0">
+  <w:abstractNum w:abstractNumId="62" w15:restartNumberingAfterBreak="0">
     <w:nsid w:val="45047E7D"/>
     <w:multiLevelType w:val="multilevel"/>
     <w:tmpl w:val="8290425C"/>
@@ -33123,7 +33677,7 @@
       </w:pPr>
     </w:lvl>
   </w:abstractNum>
-  <w:abstractNum w:abstractNumId="62" w15:restartNumberingAfterBreak="0">
+  <w:abstractNum w:abstractNumId="63" w15:restartNumberingAfterBreak="0">
     <w:nsid w:val="460C0B49"/>
     <w:multiLevelType w:val="multilevel"/>
     <w:tmpl w:val="AAA89A10"/>
@@ -33269,7 +33823,7 @@
       </w:rPr>
     </w:lvl>
   </w:abstractNum>
-  <w:abstractNum w:abstractNumId="63" w15:restartNumberingAfterBreak="0">
+  <w:abstractNum w:abstractNumId="64" w15:restartNumberingAfterBreak="0">
     <w:nsid w:val="46A60213"/>
     <w:multiLevelType w:val="multilevel"/>
     <w:tmpl w:val="09C4299A"/>
@@ -33385,7 +33939,7 @@
       </w:rPr>
     </w:lvl>
   </w:abstractNum>
-  <w:abstractNum w:abstractNumId="64" w15:restartNumberingAfterBreak="0">
+  <w:abstractNum w:abstractNumId="65" w15:restartNumberingAfterBreak="0">
     <w:nsid w:val="489A70D3"/>
     <w:multiLevelType w:val="hybridMultilevel"/>
     <w:tmpl w:val="4DC02AE8"/>
@@ -33498,7 +34052,7 @@
       </w:rPr>
     </w:lvl>
   </w:abstractNum>
-  <w:abstractNum w:abstractNumId="65" w15:restartNumberingAfterBreak="0">
+  <w:abstractNum w:abstractNumId="66" w15:restartNumberingAfterBreak="0">
     <w:nsid w:val="498C382E"/>
     <w:multiLevelType w:val="multilevel"/>
     <w:tmpl w:val="C652F494"/>
@@ -33643,7 +34197,7 @@
       </w:rPr>
     </w:lvl>
   </w:abstractNum>
-  <w:abstractNum w:abstractNumId="66" w15:restartNumberingAfterBreak="0">
+  <w:abstractNum w:abstractNumId="67" w15:restartNumberingAfterBreak="0">
     <w:nsid w:val="4C2C7376"/>
     <w:multiLevelType w:val="hybridMultilevel"/>
     <w:tmpl w:val="8FCAA6B8"/>
@@ -33756,7 +34310,7 @@
       </w:rPr>
     </w:lvl>
   </w:abstractNum>
-  <w:abstractNum w:abstractNumId="67" w15:restartNumberingAfterBreak="0">
+  <w:abstractNum w:abstractNumId="68" w15:restartNumberingAfterBreak="0">
     <w:nsid w:val="4C620822"/>
     <w:multiLevelType w:val="multilevel"/>
     <w:tmpl w:val="0410001F"/>
@@ -33871,7 +34425,7 @@
       </w:rPr>
     </w:lvl>
   </w:abstractNum>
-  <w:abstractNum w:abstractNumId="68" w15:restartNumberingAfterBreak="0">
+  <w:abstractNum w:abstractNumId="69" w15:restartNumberingAfterBreak="0">
     <w:nsid w:val="4FEC5CB2"/>
     <w:multiLevelType w:val="multilevel"/>
     <w:tmpl w:val="8290425C"/>
@@ -33961,7 +34515,7 @@
       </w:pPr>
     </w:lvl>
   </w:abstractNum>
-  <w:abstractNum w:abstractNumId="69" w15:restartNumberingAfterBreak="0">
+  <w:abstractNum w:abstractNumId="70" w15:restartNumberingAfterBreak="0">
     <w:nsid w:val="535E724F"/>
     <w:multiLevelType w:val="hybridMultilevel"/>
     <w:tmpl w:val="FFFAD0C6"/>
@@ -34074,7 +34628,7 @@
       </w:rPr>
     </w:lvl>
   </w:abstractNum>
-  <w:abstractNum w:abstractNumId="70" w15:restartNumberingAfterBreak="0">
+  <w:abstractNum w:abstractNumId="71" w15:restartNumberingAfterBreak="0">
     <w:nsid w:val="54940989"/>
     <w:multiLevelType w:val="multilevel"/>
     <w:tmpl w:val="44282C94"/>
@@ -34219,7 +34773,7 @@
       </w:rPr>
     </w:lvl>
   </w:abstractNum>
-  <w:abstractNum w:abstractNumId="71" w15:restartNumberingAfterBreak="0">
+  <w:abstractNum w:abstractNumId="72" w15:restartNumberingAfterBreak="0">
     <w:nsid w:val="56EE3CF8"/>
     <w:multiLevelType w:val="hybridMultilevel"/>
     <w:tmpl w:val="D12C20EC"/>
@@ -34308,7 +34862,7 @@
       </w:pPr>
     </w:lvl>
   </w:abstractNum>
-  <w:abstractNum w:abstractNumId="72" w15:restartNumberingAfterBreak="0">
+  <w:abstractNum w:abstractNumId="73" w15:restartNumberingAfterBreak="0">
     <w:nsid w:val="57A355A8"/>
     <w:multiLevelType w:val="hybridMultilevel"/>
     <w:tmpl w:val="9E1C1FF6"/>
@@ -34421,7 +34975,7 @@
       </w:rPr>
     </w:lvl>
   </w:abstractNum>
-  <w:abstractNum w:abstractNumId="73" w15:restartNumberingAfterBreak="0">
+  <w:abstractNum w:abstractNumId="74" w15:restartNumberingAfterBreak="0">
     <w:nsid w:val="57FE7507"/>
     <w:multiLevelType w:val="multilevel"/>
     <w:tmpl w:val="8EB2B37A"/>
@@ -34537,7 +35091,7 @@
       </w:rPr>
     </w:lvl>
   </w:abstractNum>
-  <w:abstractNum w:abstractNumId="74" w15:restartNumberingAfterBreak="0">
+  <w:abstractNum w:abstractNumId="75" w15:restartNumberingAfterBreak="0">
     <w:nsid w:val="59566F0F"/>
     <w:multiLevelType w:val="multilevel"/>
     <w:tmpl w:val="7EECA278"/>
@@ -34627,7 +35181,7 @@
       </w:pPr>
     </w:lvl>
   </w:abstractNum>
-  <w:abstractNum w:abstractNumId="75" w15:restartNumberingAfterBreak="0">
+  <w:abstractNum w:abstractNumId="76" w15:restartNumberingAfterBreak="0">
     <w:nsid w:val="5C447057"/>
     <w:multiLevelType w:val="multilevel"/>
     <w:tmpl w:val="0410001F"/>
@@ -34742,7 +35296,7 @@
       </w:rPr>
     </w:lvl>
   </w:abstractNum>
-  <w:abstractNum w:abstractNumId="76" w15:restartNumberingAfterBreak="0">
+  <w:abstractNum w:abstractNumId="77" w15:restartNumberingAfterBreak="0">
     <w:nsid w:val="5D636745"/>
     <w:multiLevelType w:val="multilevel"/>
     <w:tmpl w:val="D68A200C"/>
@@ -34858,7 +35412,7 @@
       </w:rPr>
     </w:lvl>
   </w:abstractNum>
-  <w:abstractNum w:abstractNumId="77" w15:restartNumberingAfterBreak="0">
+  <w:abstractNum w:abstractNumId="78" w15:restartNumberingAfterBreak="0">
     <w:nsid w:val="5FB73956"/>
     <w:multiLevelType w:val="hybridMultilevel"/>
     <w:tmpl w:val="8CFC3566"/>
@@ -34971,7 +35525,7 @@
       </w:rPr>
     </w:lvl>
   </w:abstractNum>
-  <w:abstractNum w:abstractNumId="78" w15:restartNumberingAfterBreak="0">
+  <w:abstractNum w:abstractNumId="79" w15:restartNumberingAfterBreak="0">
     <w:nsid w:val="608B7262"/>
     <w:multiLevelType w:val="multilevel"/>
     <w:tmpl w:val="B98CA9C4"/>
@@ -35063,7 +35617,7 @@
       </w:pPr>
     </w:lvl>
   </w:abstractNum>
-  <w:abstractNum w:abstractNumId="79" w15:restartNumberingAfterBreak="0">
+  <w:abstractNum w:abstractNumId="80" w15:restartNumberingAfterBreak="0">
     <w:nsid w:val="616C4886"/>
     <w:multiLevelType w:val="hybridMultilevel"/>
     <w:tmpl w:val="294A6590"/>
@@ -35176,7 +35730,7 @@
       </w:rPr>
     </w:lvl>
   </w:abstractNum>
-  <w:abstractNum w:abstractNumId="80" w15:restartNumberingAfterBreak="0">
+  <w:abstractNum w:abstractNumId="81" w15:restartNumberingAfterBreak="0">
     <w:nsid w:val="61B36032"/>
     <w:multiLevelType w:val="multilevel"/>
     <w:tmpl w:val="63A89A3E"/>
@@ -35266,7 +35820,7 @@
       </w:pPr>
     </w:lvl>
   </w:abstractNum>
-  <w:abstractNum w:abstractNumId="81" w15:restartNumberingAfterBreak="0">
+  <w:abstractNum w:abstractNumId="82" w15:restartNumberingAfterBreak="0">
     <w:nsid w:val="61B406A5"/>
     <w:multiLevelType w:val="multilevel"/>
     <w:tmpl w:val="0410001F"/>
@@ -35381,7 +35935,7 @@
       </w:rPr>
     </w:lvl>
   </w:abstractNum>
-  <w:abstractNum w:abstractNumId="82" w15:restartNumberingAfterBreak="0">
+  <w:abstractNum w:abstractNumId="83" w15:restartNumberingAfterBreak="0">
     <w:nsid w:val="625D6743"/>
     <w:multiLevelType w:val="hybridMultilevel"/>
     <w:tmpl w:val="DFE8781C"/>
@@ -35493,7 +36047,7 @@
       </w:rPr>
     </w:lvl>
   </w:abstractNum>
-  <w:abstractNum w:abstractNumId="83" w15:restartNumberingAfterBreak="0">
+  <w:abstractNum w:abstractNumId="84" w15:restartNumberingAfterBreak="0">
     <w:nsid w:val="62FF1815"/>
     <w:multiLevelType w:val="hybridMultilevel"/>
     <w:tmpl w:val="1DD6FB12"/>
@@ -35606,7 +36160,7 @@
       </w:rPr>
     </w:lvl>
   </w:abstractNum>
-  <w:abstractNum w:abstractNumId="84" w15:restartNumberingAfterBreak="0">
+  <w:abstractNum w:abstractNumId="85" w15:restartNumberingAfterBreak="0">
     <w:nsid w:val="648A45F5"/>
     <w:multiLevelType w:val="multilevel"/>
     <w:tmpl w:val="39247CEE"/>
@@ -35722,7 +36276,7 @@
       </w:rPr>
     </w:lvl>
   </w:abstractNum>
-  <w:abstractNum w:abstractNumId="85" w15:restartNumberingAfterBreak="0">
+  <w:abstractNum w:abstractNumId="86" w15:restartNumberingAfterBreak="0">
     <w:nsid w:val="675A268F"/>
     <w:multiLevelType w:val="hybridMultilevel"/>
     <w:tmpl w:val="D1DC8AA6"/>
@@ -35811,7 +36365,7 @@
       </w:pPr>
     </w:lvl>
   </w:abstractNum>
-  <w:abstractNum w:abstractNumId="86" w15:restartNumberingAfterBreak="0">
+  <w:abstractNum w:abstractNumId="87" w15:restartNumberingAfterBreak="0">
     <w:nsid w:val="690A7F77"/>
     <w:multiLevelType w:val="hybridMultilevel"/>
     <w:tmpl w:val="57CA3596"/>
@@ -35900,7 +36454,7 @@
       </w:pPr>
     </w:lvl>
   </w:abstractNum>
-  <w:abstractNum w:abstractNumId="87" w15:restartNumberingAfterBreak="0">
+  <w:abstractNum w:abstractNumId="88" w15:restartNumberingAfterBreak="0">
     <w:nsid w:val="69D977BC"/>
     <w:multiLevelType w:val="hybridMultilevel"/>
     <w:tmpl w:val="3176CB22"/>
@@ -35989,7 +36543,7 @@
       </w:pPr>
     </w:lvl>
   </w:abstractNum>
-  <w:abstractNum w:abstractNumId="88" w15:restartNumberingAfterBreak="0">
+  <w:abstractNum w:abstractNumId="89" w15:restartNumberingAfterBreak="0">
     <w:nsid w:val="6A477401"/>
     <w:multiLevelType w:val="hybridMultilevel"/>
     <w:tmpl w:val="96B64318"/>
@@ -36101,7 +36655,7 @@
       </w:rPr>
     </w:lvl>
   </w:abstractNum>
-  <w:abstractNum w:abstractNumId="89" w15:restartNumberingAfterBreak="0">
+  <w:abstractNum w:abstractNumId="90" w15:restartNumberingAfterBreak="0">
     <w:nsid w:val="6A8B199A"/>
     <w:multiLevelType w:val="hybridMultilevel"/>
     <w:tmpl w:val="259A0F68"/>
@@ -36214,7 +36768,7 @@
       </w:rPr>
     </w:lvl>
   </w:abstractNum>
-  <w:abstractNum w:abstractNumId="90" w15:restartNumberingAfterBreak="0">
+  <w:abstractNum w:abstractNumId="91" w15:restartNumberingAfterBreak="0">
     <w:nsid w:val="6B7F333A"/>
     <w:multiLevelType w:val="multilevel"/>
     <w:tmpl w:val="0410001F"/>
@@ -36329,7 +36883,7 @@
       </w:rPr>
     </w:lvl>
   </w:abstractNum>
-  <w:abstractNum w:abstractNumId="91" w15:restartNumberingAfterBreak="0">
+  <w:abstractNum w:abstractNumId="92" w15:restartNumberingAfterBreak="0">
     <w:nsid w:val="6D5F2D90"/>
     <w:multiLevelType w:val="hybridMultilevel"/>
     <w:tmpl w:val="85767DF8"/>
@@ -36418,7 +36972,7 @@
       </w:pPr>
     </w:lvl>
   </w:abstractNum>
-  <w:abstractNum w:abstractNumId="92" w15:restartNumberingAfterBreak="0">
+  <w:abstractNum w:abstractNumId="93" w15:restartNumberingAfterBreak="0">
     <w:nsid w:val="721A0E9F"/>
     <w:multiLevelType w:val="hybridMultilevel"/>
     <w:tmpl w:val="1A0210CC"/>
@@ -36531,7 +37085,7 @@
       </w:rPr>
     </w:lvl>
   </w:abstractNum>
-  <w:abstractNum w:abstractNumId="93" w15:restartNumberingAfterBreak="0">
+  <w:abstractNum w:abstractNumId="94" w15:restartNumberingAfterBreak="0">
     <w:nsid w:val="792D10F7"/>
     <w:multiLevelType w:val="multilevel"/>
     <w:tmpl w:val="5C56DE9E"/>
@@ -36621,7 +37175,7 @@
       </w:pPr>
     </w:lvl>
   </w:abstractNum>
-  <w:abstractNum w:abstractNumId="94" w15:restartNumberingAfterBreak="0">
+  <w:abstractNum w:abstractNumId="95" w15:restartNumberingAfterBreak="0">
     <w:nsid w:val="79FB7604"/>
     <w:multiLevelType w:val="multilevel"/>
     <w:tmpl w:val="8290425C"/>
@@ -36711,7 +37265,7 @@
       </w:pPr>
     </w:lvl>
   </w:abstractNum>
-  <w:abstractNum w:abstractNumId="95" w15:restartNumberingAfterBreak="0">
+  <w:abstractNum w:abstractNumId="96" w15:restartNumberingAfterBreak="0">
     <w:nsid w:val="7D8E778A"/>
     <w:multiLevelType w:val="hybridMultilevel"/>
     <w:tmpl w:val="D040E388"/>
@@ -36800,7 +37354,156 @@
       </w:pPr>
     </w:lvl>
   </w:abstractNum>
-  <w:abstractNum w:abstractNumId="96" w15:restartNumberingAfterBreak="0">
+  <w:abstractNum w:abstractNumId="97" w15:restartNumberingAfterBreak="0">
+    <w:nsid w:val="7E8510B9"/>
+    <w:multiLevelType w:val="multilevel"/>
+    <w:tmpl w:val="7F2674E8"/>
+    <w:lvl w:ilvl="0">
+      <w:start w:val="1"/>
+      <w:numFmt w:val="bullet"/>
+      <w:lvlText w:val=""/>
+      <w:lvlJc w:val="left"/>
+      <w:pPr>
+        <w:tabs>
+          <w:tab w:val="num" w:pos="720"/>
+        </w:tabs>
+        <w:ind w:left="720" w:hanging="360"/>
+      </w:pPr>
+      <w:rPr>
+        <w:rFonts w:ascii="Symbol" w:hAnsi="Symbol" w:hint="default"/>
+        <w:sz w:val="20"/>
+      </w:rPr>
+    </w:lvl>
+    <w:lvl w:ilvl="1" w:tentative="1">
+      <w:start w:val="1"/>
+      <w:numFmt w:val="bullet"/>
+      <w:lvlText w:val="o"/>
+      <w:lvlJc w:val="left"/>
+      <w:pPr>
+        <w:tabs>
+          <w:tab w:val="num" w:pos="1440"/>
+        </w:tabs>
+        <w:ind w:left="1440" w:hanging="360"/>
+      </w:pPr>
+      <w:rPr>
+        <w:rFonts w:ascii="Courier New" w:hAnsi="Courier New" w:hint="default"/>
+        <w:sz w:val="20"/>
+      </w:rPr>
+    </w:lvl>
+    <w:lvl w:ilvl="2" w:tentative="1">
+      <w:start w:val="1"/>
+      <w:numFmt w:val="bullet"/>
+      <w:lvlText w:val=""/>
+      <w:lvlJc w:val="left"/>
+      <w:pPr>
+        <w:tabs>
+          <w:tab w:val="num" w:pos="2160"/>
+        </w:tabs>
+        <w:ind w:left="2160" w:hanging="360"/>
+      </w:pPr>
+      <w:rPr>
+        <w:rFonts w:ascii="Wingdings" w:hAnsi="Wingdings" w:hint="default"/>
+        <w:sz w:val="20"/>
+      </w:rPr>
+    </w:lvl>
+    <w:lvl w:ilvl="3" w:tentative="1">
+      <w:start w:val="1"/>
+      <w:numFmt w:val="bullet"/>
+      <w:lvlText w:val=""/>
+      <w:lvlJc w:val="left"/>
+      <w:pPr>
+        <w:tabs>
+          <w:tab w:val="num" w:pos="2880"/>
+        </w:tabs>
+        <w:ind w:left="2880" w:hanging="360"/>
+      </w:pPr>
+      <w:rPr>
+        <w:rFonts w:ascii="Wingdings" w:hAnsi="Wingdings" w:hint="default"/>
+        <w:sz w:val="20"/>
+      </w:rPr>
+    </w:lvl>
+    <w:lvl w:ilvl="4" w:tentative="1">
+      <w:start w:val="1"/>
+      <w:numFmt w:val="bullet"/>
+      <w:lvlText w:val=""/>
+      <w:lvlJc w:val="left"/>
+      <w:pPr>
+        <w:tabs>
+          <w:tab w:val="num" w:pos="3600"/>
+        </w:tabs>
+        <w:ind w:left="3600" w:hanging="360"/>
+      </w:pPr>
+      <w:rPr>
+        <w:rFonts w:ascii="Wingdings" w:hAnsi="Wingdings" w:hint="default"/>
+        <w:sz w:val="20"/>
+      </w:rPr>
+    </w:lvl>
+    <w:lvl w:ilvl="5" w:tentative="1">
+      <w:start w:val="1"/>
+      <w:numFmt w:val="bullet"/>
+      <w:lvlText w:val=""/>
+      <w:lvlJc w:val="left"/>
+      <w:pPr>
+        <w:tabs>
+          <w:tab w:val="num" w:pos="4320"/>
+        </w:tabs>
+        <w:ind w:left="4320" w:hanging="360"/>
+      </w:pPr>
+      <w:rPr>
+        <w:rFonts w:ascii="Wingdings" w:hAnsi="Wingdings" w:hint="default"/>
+        <w:sz w:val="20"/>
+      </w:rPr>
+    </w:lvl>
+    <w:lvl w:ilvl="6" w:tentative="1">
+      <w:start w:val="1"/>
+      <w:numFmt w:val="bullet"/>
+      <w:lvlText w:val=""/>
+      <w:lvlJc w:val="left"/>
+      <w:pPr>
+        <w:tabs>
+          <w:tab w:val="num" w:pos="5040"/>
+        </w:tabs>
+        <w:ind w:left="5040" w:hanging="360"/>
+      </w:pPr>
+      <w:rPr>
+        <w:rFonts w:ascii="Wingdings" w:hAnsi="Wingdings" w:hint="default"/>
+        <w:sz w:val="20"/>
+      </w:rPr>
+    </w:lvl>
+    <w:lvl w:ilvl="7" w:tentative="1">
+      <w:start w:val="1"/>
+      <w:numFmt w:val="bullet"/>
+      <w:lvlText w:val=""/>
+      <w:lvlJc w:val="left"/>
+      <w:pPr>
+        <w:tabs>
+          <w:tab w:val="num" w:pos="5760"/>
+        </w:tabs>
+        <w:ind w:left="5760" w:hanging="360"/>
+      </w:pPr>
+      <w:rPr>
+        <w:rFonts w:ascii="Wingdings" w:hAnsi="Wingdings" w:hint="default"/>
+        <w:sz w:val="20"/>
+      </w:rPr>
+    </w:lvl>
+    <w:lvl w:ilvl="8" w:tentative="1">
+      <w:start w:val="1"/>
+      <w:numFmt w:val="bullet"/>
+      <w:lvlText w:val=""/>
+      <w:lvlJc w:val="left"/>
+      <w:pPr>
+        <w:tabs>
+          <w:tab w:val="num" w:pos="6480"/>
+        </w:tabs>
+        <w:ind w:left="6480" w:hanging="360"/>
+      </w:pPr>
+      <w:rPr>
+        <w:rFonts w:ascii="Wingdings" w:hAnsi="Wingdings" w:hint="default"/>
+        <w:sz w:val="20"/>
+      </w:rPr>
+    </w:lvl>
+  </w:abstractNum>
+  <w:abstractNum w:abstractNumId="98" w15:restartNumberingAfterBreak="0">
     <w:nsid w:val="7EB65393"/>
     <w:multiLevelType w:val="multilevel"/>
     <w:tmpl w:val="036210C4"/>
@@ -36923,25 +37626,25 @@
     <w:abstractNumId w:val="15"/>
   </w:num>
   <w:num w:numId="3" w16cid:durableId="101149811">
-    <w:abstractNumId w:val="81"/>
+    <w:abstractNumId w:val="82"/>
   </w:num>
   <w:num w:numId="4" w16cid:durableId="1882669730">
     <w:abstractNumId w:val="34"/>
   </w:num>
   <w:num w:numId="5" w16cid:durableId="741878819">
-    <w:abstractNumId w:val="69"/>
+    <w:abstractNumId w:val="70"/>
   </w:num>
   <w:num w:numId="6" w16cid:durableId="164364522">
-    <w:abstractNumId w:val="71"/>
+    <w:abstractNumId w:val="72"/>
   </w:num>
   <w:num w:numId="7" w16cid:durableId="544096761">
-    <w:abstractNumId w:val="95"/>
+    <w:abstractNumId w:val="96"/>
   </w:num>
   <w:num w:numId="8" w16cid:durableId="1220673695">
     <w:abstractNumId w:val="2"/>
   </w:num>
   <w:num w:numId="9" w16cid:durableId="189537513">
-    <w:abstractNumId w:val="88"/>
+    <w:abstractNumId w:val="89"/>
   </w:num>
   <w:num w:numId="10" w16cid:durableId="81804924">
     <w:abstractNumId w:val="5"/>
@@ -36950,7 +37653,7 @@
     <w:abstractNumId w:val="23"/>
   </w:num>
   <w:num w:numId="12" w16cid:durableId="1800493463">
-    <w:abstractNumId w:val="53"/>
+    <w:abstractNumId w:val="54"/>
   </w:num>
   <w:num w:numId="13" w16cid:durableId="580993923">
     <w:abstractNumId w:val="21"/>
@@ -36959,10 +37662,10 @@
     <w:abstractNumId w:val="10"/>
   </w:num>
   <w:num w:numId="15" w16cid:durableId="2018386991">
-    <w:abstractNumId w:val="85"/>
+    <w:abstractNumId w:val="86"/>
   </w:num>
   <w:num w:numId="16" w16cid:durableId="1459835934">
-    <w:abstractNumId w:val="74"/>
+    <w:abstractNumId w:val="75"/>
   </w:num>
   <w:num w:numId="17" w16cid:durableId="1278297084">
     <w:abstractNumId w:val="9"/>
@@ -36971,64 +37674,64 @@
     <w:abstractNumId w:val="12"/>
   </w:num>
   <w:num w:numId="19" w16cid:durableId="556017036">
-    <w:abstractNumId w:val="44"/>
+    <w:abstractNumId w:val="45"/>
   </w:num>
   <w:num w:numId="20" w16cid:durableId="945578947">
     <w:abstractNumId w:val="11"/>
   </w:num>
   <w:num w:numId="21" w16cid:durableId="1774744920">
-    <w:abstractNumId w:val="46"/>
+    <w:abstractNumId w:val="47"/>
   </w:num>
   <w:num w:numId="22" w16cid:durableId="1744836374">
     <w:abstractNumId w:val="24"/>
   </w:num>
   <w:num w:numId="23" w16cid:durableId="253250013">
-    <w:abstractNumId w:val="40"/>
+    <w:abstractNumId w:val="41"/>
   </w:num>
   <w:num w:numId="24" w16cid:durableId="1169097513">
     <w:abstractNumId w:val="17"/>
   </w:num>
   <w:num w:numId="25" w16cid:durableId="905267596">
-    <w:abstractNumId w:val="80"/>
+    <w:abstractNumId w:val="81"/>
   </w:num>
   <w:num w:numId="26" w16cid:durableId="1866675035">
-    <w:abstractNumId w:val="54"/>
+    <w:abstractNumId w:val="55"/>
   </w:num>
   <w:num w:numId="27" w16cid:durableId="1505168615">
     <w:abstractNumId w:val="32"/>
   </w:num>
   <w:num w:numId="28" w16cid:durableId="1010719973">
-    <w:abstractNumId w:val="67"/>
+    <w:abstractNumId w:val="68"/>
   </w:num>
   <w:num w:numId="29" w16cid:durableId="701049897">
+    <w:abstractNumId w:val="92"/>
+  </w:num>
+  <w:num w:numId="30" w16cid:durableId="1865434144">
     <w:abstractNumId w:val="91"/>
   </w:num>
-  <w:num w:numId="30" w16cid:durableId="1865434144">
-    <w:abstractNumId w:val="90"/>
-  </w:num>
   <w:num w:numId="31" w16cid:durableId="896668450">
-    <w:abstractNumId w:val="49"/>
+    <w:abstractNumId w:val="50"/>
   </w:num>
   <w:num w:numId="32" w16cid:durableId="1085607809">
-    <w:abstractNumId w:val="94"/>
+    <w:abstractNumId w:val="95"/>
   </w:num>
   <w:num w:numId="33" w16cid:durableId="1346783908">
-    <w:abstractNumId w:val="68"/>
+    <w:abstractNumId w:val="69"/>
   </w:num>
   <w:num w:numId="34" w16cid:durableId="2027751185">
-    <w:abstractNumId w:val="47"/>
+    <w:abstractNumId w:val="48"/>
   </w:num>
   <w:num w:numId="35" w16cid:durableId="75637572">
-    <w:abstractNumId w:val="41"/>
+    <w:abstractNumId w:val="42"/>
   </w:num>
   <w:num w:numId="36" w16cid:durableId="627515960">
     <w:abstractNumId w:val="35"/>
   </w:num>
   <w:num w:numId="37" w16cid:durableId="414592066">
-    <w:abstractNumId w:val="75"/>
+    <w:abstractNumId w:val="76"/>
   </w:num>
   <w:num w:numId="38" w16cid:durableId="661857738">
-    <w:abstractNumId w:val="86"/>
+    <w:abstractNumId w:val="87"/>
   </w:num>
   <w:num w:numId="39" w16cid:durableId="840703845">
     <w:abstractNumId w:val="3"/>
@@ -37040,28 +37743,28 @@
     <w:abstractNumId w:val="36"/>
   </w:num>
   <w:num w:numId="42" w16cid:durableId="806510852">
-    <w:abstractNumId w:val="87"/>
+    <w:abstractNumId w:val="88"/>
   </w:num>
   <w:num w:numId="43" w16cid:durableId="1655912606">
     <w:abstractNumId w:val="4"/>
   </w:num>
   <w:num w:numId="44" w16cid:durableId="533273250">
-    <w:abstractNumId w:val="45"/>
+    <w:abstractNumId w:val="46"/>
   </w:num>
   <w:num w:numId="45" w16cid:durableId="39744436">
-    <w:abstractNumId w:val="79"/>
+    <w:abstractNumId w:val="80"/>
   </w:num>
   <w:num w:numId="46" w16cid:durableId="223490498">
     <w:abstractNumId w:val="29"/>
   </w:num>
   <w:num w:numId="47" w16cid:durableId="1929000350">
-    <w:abstractNumId w:val="65"/>
+    <w:abstractNumId w:val="66"/>
   </w:num>
   <w:num w:numId="48" w16cid:durableId="1760248612">
     <w:abstractNumId w:val="25"/>
   </w:num>
   <w:num w:numId="49" w16cid:durableId="2102290966">
-    <w:abstractNumId w:val="70"/>
+    <w:abstractNumId w:val="71"/>
   </w:num>
   <w:num w:numId="50" w16cid:durableId="620461000">
     <w:abstractNumId w:val="28"/>
@@ -37073,43 +37776,43 @@
     <w:abstractNumId w:val="6"/>
   </w:num>
   <w:num w:numId="53" w16cid:durableId="61367141">
-    <w:abstractNumId w:val="93"/>
+    <w:abstractNumId w:val="94"/>
   </w:num>
   <w:num w:numId="54" w16cid:durableId="1845854204">
-    <w:abstractNumId w:val="48"/>
+    <w:abstractNumId w:val="49"/>
   </w:num>
   <w:num w:numId="55" w16cid:durableId="1469318401">
-    <w:abstractNumId w:val="78"/>
+    <w:abstractNumId w:val="79"/>
   </w:num>
   <w:num w:numId="56" w16cid:durableId="1847591480">
     <w:abstractNumId w:val="13"/>
   </w:num>
   <w:num w:numId="57" w16cid:durableId="1179346034">
-    <w:abstractNumId w:val="61"/>
+    <w:abstractNumId w:val="62"/>
   </w:num>
   <w:num w:numId="58" w16cid:durableId="1642692020">
     <w:abstractNumId w:val="33"/>
   </w:num>
   <w:num w:numId="59" w16cid:durableId="1733844956">
-    <w:abstractNumId w:val="96"/>
+    <w:abstractNumId w:val="98"/>
   </w:num>
   <w:num w:numId="60" w16cid:durableId="118652113">
-    <w:abstractNumId w:val="76"/>
+    <w:abstractNumId w:val="77"/>
   </w:num>
   <w:num w:numId="61" w16cid:durableId="1852524741">
-    <w:abstractNumId w:val="73"/>
+    <w:abstractNumId w:val="74"/>
   </w:num>
   <w:num w:numId="62" w16cid:durableId="1486554923">
-    <w:abstractNumId w:val="56"/>
+    <w:abstractNumId w:val="57"/>
   </w:num>
   <w:num w:numId="63" w16cid:durableId="1801532872">
     <w:abstractNumId w:val="26"/>
   </w:num>
   <w:num w:numId="64" w16cid:durableId="303704435">
-    <w:abstractNumId w:val="84"/>
+    <w:abstractNumId w:val="85"/>
   </w:num>
   <w:num w:numId="65" w16cid:durableId="1558904966">
-    <w:abstractNumId w:val="51"/>
+    <w:abstractNumId w:val="52"/>
   </w:num>
   <w:num w:numId="66" w16cid:durableId="171914293">
     <w:abstractNumId w:val="31"/>
@@ -37118,49 +37821,49 @@
     <w:abstractNumId w:val="30"/>
   </w:num>
   <w:num w:numId="68" w16cid:durableId="1294558089">
-    <w:abstractNumId w:val="63"/>
+    <w:abstractNumId w:val="64"/>
   </w:num>
   <w:num w:numId="69" w16cid:durableId="1552498583">
-    <w:abstractNumId w:val="57"/>
+    <w:abstractNumId w:val="58"/>
   </w:num>
   <w:num w:numId="70" w16cid:durableId="1930457438">
-    <w:abstractNumId w:val="60"/>
+    <w:abstractNumId w:val="61"/>
   </w:num>
   <w:num w:numId="71" w16cid:durableId="608395196">
-    <w:abstractNumId w:val="89"/>
+    <w:abstractNumId w:val="90"/>
   </w:num>
   <w:num w:numId="72" w16cid:durableId="722145001">
     <w:abstractNumId w:val="0"/>
   </w:num>
   <w:num w:numId="73" w16cid:durableId="2009284840">
-    <w:abstractNumId w:val="50"/>
+    <w:abstractNumId w:val="51"/>
   </w:num>
   <w:num w:numId="74" w16cid:durableId="439106656">
-    <w:abstractNumId w:val="62"/>
+    <w:abstractNumId w:val="63"/>
   </w:num>
   <w:num w:numId="75" w16cid:durableId="2078092314">
     <w:abstractNumId w:val="14"/>
   </w:num>
   <w:num w:numId="76" w16cid:durableId="988052946">
-    <w:abstractNumId w:val="37"/>
+    <w:abstractNumId w:val="38"/>
   </w:num>
   <w:num w:numId="77" w16cid:durableId="1627349877">
-    <w:abstractNumId w:val="52"/>
+    <w:abstractNumId w:val="53"/>
   </w:num>
   <w:num w:numId="78" w16cid:durableId="1070231875">
     <w:abstractNumId w:val="27"/>
   </w:num>
   <w:num w:numId="79" w16cid:durableId="1161460922">
-    <w:abstractNumId w:val="59"/>
+    <w:abstractNumId w:val="60"/>
   </w:num>
   <w:num w:numId="80" w16cid:durableId="157966052">
-    <w:abstractNumId w:val="38"/>
+    <w:abstractNumId w:val="39"/>
   </w:num>
   <w:num w:numId="81" w16cid:durableId="1359623247">
-    <w:abstractNumId w:val="92"/>
+    <w:abstractNumId w:val="93"/>
   </w:num>
   <w:num w:numId="82" w16cid:durableId="893849582">
-    <w:abstractNumId w:val="72"/>
+    <w:abstractNumId w:val="73"/>
   </w:num>
   <w:num w:numId="83" w16cid:durableId="1910185468">
     <w:abstractNumId w:val="8"/>
@@ -37172,7 +37875,7 @@
     <w:abstractNumId w:val="7"/>
   </w:num>
   <w:num w:numId="86" w16cid:durableId="956183072">
-    <w:abstractNumId w:val="42"/>
+    <w:abstractNumId w:val="43"/>
   </w:num>
   <w:num w:numId="87" w16cid:durableId="1332760234">
     <w:abstractNumId w:val="20"/>
@@ -37181,34 +37884,40 @@
     <w:abstractNumId w:val="19"/>
   </w:num>
   <w:num w:numId="89" w16cid:durableId="1943606095">
-    <w:abstractNumId w:val="83"/>
+    <w:abstractNumId w:val="84"/>
   </w:num>
   <w:num w:numId="90" w16cid:durableId="194393743">
-    <w:abstractNumId w:val="55"/>
+    <w:abstractNumId w:val="56"/>
   </w:num>
   <w:num w:numId="91" w16cid:durableId="969047299">
-    <w:abstractNumId w:val="58"/>
+    <w:abstractNumId w:val="59"/>
   </w:num>
   <w:num w:numId="92" w16cid:durableId="1148742232">
     <w:abstractNumId w:val="18"/>
   </w:num>
   <w:num w:numId="93" w16cid:durableId="585263997">
-    <w:abstractNumId w:val="43"/>
+    <w:abstractNumId w:val="44"/>
   </w:num>
   <w:num w:numId="94" w16cid:durableId="446899501">
-    <w:abstractNumId w:val="77"/>
+    <w:abstractNumId w:val="78"/>
   </w:num>
   <w:num w:numId="95" w16cid:durableId="200946549">
-    <w:abstractNumId w:val="64"/>
+    <w:abstractNumId w:val="65"/>
   </w:num>
   <w:num w:numId="96" w16cid:durableId="987514331">
-    <w:abstractNumId w:val="39"/>
+    <w:abstractNumId w:val="40"/>
   </w:num>
   <w:num w:numId="97" w16cid:durableId="688873466">
-    <w:abstractNumId w:val="66"/>
+    <w:abstractNumId w:val="67"/>
   </w:num>
   <w:num w:numId="98" w16cid:durableId="156113264">
-    <w:abstractNumId w:val="82"/>
+    <w:abstractNumId w:val="83"/>
+  </w:num>
+  <w:num w:numId="99" w16cid:durableId="1702895458">
+    <w:abstractNumId w:val="37"/>
+  </w:num>
+  <w:num w:numId="100" w16cid:durableId="797380257">
+    <w:abstractNumId w:val="97"/>
   </w:num>
   <w:numIdMacAtCleanup w:val="97"/>
 </w:numbering>
@@ -37730,7 +38439,6 @@
   <w:style w:type="character" w:default="1" w:styleId="Carpredefinitoparagrafo">
     <w:name w:val="Default Paragraph Font"/>
     <w:uiPriority w:val="1"/>
-    <w:semiHidden/>
     <w:unhideWhenUsed/>
   </w:style>
   <w:style w:type="table" w:default="1" w:styleId="Tabellanormale">
@@ -39375,22 +40083,50 @@
 </file>
 
 <file path=customXml/item1.xml><?xml version="1.0" encoding="utf-8"?>
+<p:properties xmlns:p="http://schemas.microsoft.com/office/2006/metadata/properties" xmlns:xsi="http://www.w3.org/2001/XMLSchema-instance" xmlns:pc="http://schemas.microsoft.com/office/infopath/2007/PartnerControls">
+  <documentManagement>
+    <_activity xmlns="842baacf-de45-4b8d-9e7b-d034e0eebef0" xsi:nil="true"/>
+  </documentManagement>
+</p:properties>
+</file>
+
+<file path=customXml/item2.xml><?xml version="1.0" encoding="utf-8"?>
+<?mso-contentType ?>
+<FormTemplates xmlns="http://schemas.microsoft.com/sharepoint/v3/contenttype/forms">
+  <Display>DocumentLibraryForm</Display>
+  <Edit>DocumentLibraryForm</Edit>
+  <New>DocumentLibraryForm</New>
+</FormTemplates>
+</file>
+
+<file path=customXml/item3.xml><?xml version="1.0" encoding="utf-8"?>
 <b:Sources xmlns:b="http://schemas.openxmlformats.org/officeDocument/2006/bibliography" xmlns="http://schemas.openxmlformats.org/officeDocument/2006/bibliography" SelectedStyle="/APA.XSL" StyleName="APA"/>
 </file>
 
-<file path=customXml/item2.xml><?xml version="1.0" encoding="utf-8"?>
-<ct:contentTypeSchema xmlns:ct="http://schemas.microsoft.com/office/2006/metadata/contentType" xmlns:ma="http://schemas.microsoft.com/office/2006/metadata/properties/metaAttributes" ct:_="" ma:_="" ma:contentTypeName="Document" ma:contentTypeID="0x0101006F04A4F13508C741ACE8AA56FFE3D10B" ma:contentTypeVersion="3" ma:contentTypeDescription="Create a new document." ma:contentTypeScope="" ma:versionID="ae74d4b9aee1c489174765fe6dbf7085">
-  <xsd:schema xmlns:xsd="http://www.w3.org/2001/XMLSchema" xmlns:xs="http://www.w3.org/2001/XMLSchema" xmlns:p="http://schemas.microsoft.com/office/2006/metadata/properties" xmlns:ns2="73091f6d-7efc-4d80-b345-57c665de3b33" targetNamespace="http://schemas.microsoft.com/office/2006/metadata/properties" ma:root="true" ma:fieldsID="ad47a26360bfbf964ac1e7e308878997" ns2:_="">
-    <xsd:import namespace="73091f6d-7efc-4d80-b345-57c665de3b33"/>
+<file path=customXml/item4.xml><?xml version="1.0" encoding="utf-8"?>
+<ct:contentTypeSchema xmlns:ct="http://schemas.microsoft.com/office/2006/metadata/contentType" xmlns:ma="http://schemas.microsoft.com/office/2006/metadata/properties/metaAttributes" ct:_="" ma:_="" ma:contentTypeName="Document" ma:contentTypeID="0x010100A7670FDDFEE71D4286C518F325139D99" ma:contentTypeVersion="13" ma:contentTypeDescription="Create a new document." ma:contentTypeScope="" ma:versionID="1bab955fb498e444d631bfc5d6036fb0">
+  <xsd:schema xmlns:xsd="http://www.w3.org/2001/XMLSchema" xmlns:xs="http://www.w3.org/2001/XMLSchema" xmlns:p="http://schemas.microsoft.com/office/2006/metadata/properties" xmlns:ns3="842baacf-de45-4b8d-9e7b-d034e0eebef0" xmlns:ns4="ab6a8521-2e52-4959-802d-4d18c7b29c90" targetNamespace="http://schemas.microsoft.com/office/2006/metadata/properties" ma:root="true" ma:fieldsID="5e74dde20c03f08eb48f98969b58ee31" ns3:_="" ns4:_="">
+    <xsd:import namespace="842baacf-de45-4b8d-9e7b-d034e0eebef0"/>
+    <xsd:import namespace="ab6a8521-2e52-4959-802d-4d18c7b29c90"/>
     <xsd:element name="properties">
       <xsd:complexType>
         <xsd:sequence>
           <xsd:element name="documentManagement">
             <xsd:complexType>
               <xsd:all>
-                <xsd:element ref="ns2:MediaServiceMetadata" minOccurs="0"/>
-                <xsd:element ref="ns2:MediaServiceFastMetadata" minOccurs="0"/>
-                <xsd:element ref="ns2:MediaServiceSearchProperties" minOccurs="0"/>
+                <xsd:element ref="ns3:_activity" minOccurs="0"/>
+                <xsd:element ref="ns4:SharedWithUsers" minOccurs="0"/>
+                <xsd:element ref="ns4:SharedWithDetails" minOccurs="0"/>
+                <xsd:element ref="ns4:SharingHintHash" minOccurs="0"/>
+                <xsd:element ref="ns3:MediaServiceMetadata" minOccurs="0"/>
+                <xsd:element ref="ns3:MediaServiceFastMetadata" minOccurs="0"/>
+                <xsd:element ref="ns3:MediaServiceObjectDetectorVersions" minOccurs="0"/>
+                <xsd:element ref="ns3:MediaServiceSystemTags" minOccurs="0"/>
+                <xsd:element ref="ns3:MediaServiceOCR" minOccurs="0"/>
+                <xsd:element ref="ns3:MediaServiceGenerationTime" minOccurs="0"/>
+                <xsd:element ref="ns3:MediaServiceEventHashCode" minOccurs="0"/>
+                <xsd:element ref="ns3:MediaServiceSearchProperties" minOccurs="0"/>
+                <xsd:element ref="ns3:MediaServiceDateTaken" minOccurs="0"/>
               </xsd:all>
             </xsd:complexType>
           </xsd:element>
@@ -39398,22 +40134,94 @@
       </xsd:complexType>
     </xsd:element>
   </xsd:schema>
-  <xsd:schema xmlns:xsd="http://www.w3.org/2001/XMLSchema" xmlns:xs="http://www.w3.org/2001/XMLSchema" xmlns:dms="http://schemas.microsoft.com/office/2006/documentManagement/types" xmlns:pc="http://schemas.microsoft.com/office/infopath/2007/PartnerControls" targetNamespace="73091f6d-7efc-4d80-b345-57c665de3b33" elementFormDefault="qualified">
+  <xsd:schema xmlns:xsd="http://www.w3.org/2001/XMLSchema" xmlns:xs="http://www.w3.org/2001/XMLSchema" xmlns:dms="http://schemas.microsoft.com/office/2006/documentManagement/types" xmlns:pc="http://schemas.microsoft.com/office/infopath/2007/PartnerControls" targetNamespace="842baacf-de45-4b8d-9e7b-d034e0eebef0" elementFormDefault="qualified">
     <xsd:import namespace="http://schemas.microsoft.com/office/2006/documentManagement/types"/>
     <xsd:import namespace="http://schemas.microsoft.com/office/infopath/2007/PartnerControls"/>
-    <xsd:element name="MediaServiceMetadata" ma:index="8" nillable="true" ma:displayName="MediaServiceMetadata" ma:hidden="true" ma:internalName="MediaServiceMetadata" ma:readOnly="true">
+    <xsd:element name="_activity" ma:index="8" nillable="true" ma:displayName="_activity" ma:hidden="true" ma:internalName="_activity">
       <xsd:simpleType>
         <xsd:restriction base="dms:Note"/>
       </xsd:simpleType>
     </xsd:element>
-    <xsd:element name="MediaServiceFastMetadata" ma:index="9" nillable="true" ma:displayName="MediaServiceFastMetadata" ma:hidden="true" ma:internalName="MediaServiceFastMetadata" ma:readOnly="true">
+    <xsd:element name="MediaServiceMetadata" ma:index="12" nillable="true" ma:displayName="MediaServiceMetadata" ma:hidden="true" ma:internalName="MediaServiceMetadata" ma:readOnly="true">
       <xsd:simpleType>
         <xsd:restriction base="dms:Note"/>
       </xsd:simpleType>
     </xsd:element>
-    <xsd:element name="MediaServiceSearchProperties" ma:index="10" nillable="true" ma:displayName="MediaServiceSearchProperties" ma:hidden="true" ma:internalName="MediaServiceSearchProperties" ma:readOnly="true">
+    <xsd:element name="MediaServiceFastMetadata" ma:index="13" nillable="true" ma:displayName="MediaServiceFastMetadata" ma:hidden="true" ma:internalName="MediaServiceFastMetadata" ma:readOnly="true">
       <xsd:simpleType>
         <xsd:restriction base="dms:Note"/>
+      </xsd:simpleType>
+    </xsd:element>
+    <xsd:element name="MediaServiceObjectDetectorVersions" ma:index="14" nillable="true" ma:displayName="MediaServiceObjectDetectorVersions" ma:hidden="true" ma:indexed="true" ma:internalName="MediaServiceObjectDetectorVersions" ma:readOnly="true">
+      <xsd:simpleType>
+        <xsd:restriction base="dms:Text"/>
+      </xsd:simpleType>
+    </xsd:element>
+    <xsd:element name="MediaServiceSystemTags" ma:index="15" nillable="true" ma:displayName="MediaServiceSystemTags" ma:hidden="true" ma:internalName="MediaServiceSystemTags" ma:readOnly="true">
+      <xsd:simpleType>
+        <xsd:restriction base="dms:Note"/>
+      </xsd:simpleType>
+    </xsd:element>
+    <xsd:element name="MediaServiceOCR" ma:index="16" nillable="true" ma:displayName="Extracted Text" ma:internalName="MediaServiceOCR" ma:readOnly="true">
+      <xsd:simpleType>
+        <xsd:restriction base="dms:Note">
+          <xsd:maxLength value="255"/>
+        </xsd:restriction>
+      </xsd:simpleType>
+    </xsd:element>
+    <xsd:element name="MediaServiceGenerationTime" ma:index="17" nillable="true" ma:displayName="MediaServiceGenerationTime" ma:hidden="true" ma:internalName="MediaServiceGenerationTime" ma:readOnly="true">
+      <xsd:simpleType>
+        <xsd:restriction base="dms:Text"/>
+      </xsd:simpleType>
+    </xsd:element>
+    <xsd:element name="MediaServiceEventHashCode" ma:index="18" nillable="true" ma:displayName="MediaServiceEventHashCode" ma:hidden="true" ma:internalName="MediaServiceEventHashCode" ma:readOnly="true">
+      <xsd:simpleType>
+        <xsd:restriction base="dms:Text"/>
+      </xsd:simpleType>
+    </xsd:element>
+    <xsd:element name="MediaServiceSearchProperties" ma:index="19" nillable="true" ma:displayName="MediaServiceSearchProperties" ma:hidden="true" ma:internalName="MediaServiceSearchProperties" ma:readOnly="true">
+      <xsd:simpleType>
+        <xsd:restriction base="dms:Note"/>
+      </xsd:simpleType>
+    </xsd:element>
+    <xsd:element name="MediaServiceDateTaken" ma:index="20" nillable="true" ma:displayName="MediaServiceDateTaken" ma:hidden="true" ma:indexed="true" ma:internalName="MediaServiceDateTaken" ma:readOnly="true">
+      <xsd:simpleType>
+        <xsd:restriction base="dms:Text"/>
+      </xsd:simpleType>
+    </xsd:element>
+  </xsd:schema>
+  <xsd:schema xmlns:xsd="http://www.w3.org/2001/XMLSchema" xmlns:xs="http://www.w3.org/2001/XMLSchema" xmlns:dms="http://schemas.microsoft.com/office/2006/documentManagement/types" xmlns:pc="http://schemas.microsoft.com/office/infopath/2007/PartnerControls" targetNamespace="ab6a8521-2e52-4959-802d-4d18c7b29c90" elementFormDefault="qualified">
+    <xsd:import namespace="http://schemas.microsoft.com/office/2006/documentManagement/types"/>
+    <xsd:import namespace="http://schemas.microsoft.com/office/infopath/2007/PartnerControls"/>
+    <xsd:element name="SharedWithUsers" ma:index="9" nillable="true" ma:displayName="Shared With" ma:internalName="SharedWithUsers" ma:readOnly="true">
+      <xsd:complexType>
+        <xsd:complexContent>
+          <xsd:extension base="dms:UserMulti">
+            <xsd:sequence>
+              <xsd:element name="UserInfo" minOccurs="0" maxOccurs="unbounded">
+                <xsd:complexType>
+                  <xsd:sequence>
+                    <xsd:element name="DisplayName" type="xsd:string" minOccurs="0"/>
+                    <xsd:element name="AccountId" type="dms:UserId" minOccurs="0" nillable="true"/>
+                    <xsd:element name="AccountType" type="xsd:string" minOccurs="0"/>
+                  </xsd:sequence>
+                </xsd:complexType>
+              </xsd:element>
+            </xsd:sequence>
+          </xsd:extension>
+        </xsd:complexContent>
+      </xsd:complexType>
+    </xsd:element>
+    <xsd:element name="SharedWithDetails" ma:index="10" nillable="true" ma:displayName="Shared With Details" ma:internalName="SharedWithDetails" ma:readOnly="true">
+      <xsd:simpleType>
+        <xsd:restriction base="dms:Note">
+          <xsd:maxLength value="255"/>
+        </xsd:restriction>
+      </xsd:simpleType>
+    </xsd:element>
+    <xsd:element name="SharingHintHash" ma:index="11" nillable="true" ma:displayName="Sharing Hint Hash" ma:hidden="true" ma:internalName="SharingHintHash" ma:readOnly="true">
+      <xsd:simpleType>
+        <xsd:restriction base="dms:Text"/>
       </xsd:simpleType>
     </xsd:element>
   </xsd:schema>
@@ -39516,22 +40324,25 @@
 </ct:contentTypeSchema>
 </file>
 
-<file path=customXml/item3.xml><?xml version="1.0" encoding="utf-8"?>
-<?mso-contentType ?>
-<FormTemplates xmlns="http://schemas.microsoft.com/sharepoint/v3/contenttype/forms">
-  <Display>DocumentLibraryForm</Display>
-  <Edit>DocumentLibraryForm</Edit>
-  <New>DocumentLibraryForm</New>
-</FormTemplates>
+<file path=customXml/itemProps1.xml><?xml version="1.0" encoding="utf-8"?>
+<ds:datastoreItem xmlns:ds="http://schemas.openxmlformats.org/officeDocument/2006/customXml" ds:itemID="{B1FF55AB-12A0-4DCC-B57A-E7539478881A}">
+  <ds:schemaRefs>
+    <ds:schemaRef ds:uri="http://schemas.microsoft.com/office/2006/metadata/properties"/>
+    <ds:schemaRef ds:uri="http://schemas.microsoft.com/office/infopath/2007/PartnerControls"/>
+    <ds:schemaRef ds:uri="842baacf-de45-4b8d-9e7b-d034e0eebef0"/>
+  </ds:schemaRefs>
+</ds:datastoreItem>
 </file>
 
-<file path=customXml/item4.xml><?xml version="1.0" encoding="utf-8"?>
-<p:properties xmlns:p="http://schemas.microsoft.com/office/2006/metadata/properties" xmlns:xsi="http://www.w3.org/2001/XMLSchema-instance" xmlns:pc="http://schemas.microsoft.com/office/infopath/2007/PartnerControls">
-  <documentManagement/>
-</p:properties>
+<file path=customXml/itemProps2.xml><?xml version="1.0" encoding="utf-8"?>
+<ds:datastoreItem xmlns:ds="http://schemas.openxmlformats.org/officeDocument/2006/customXml" ds:itemID="{7A92FC2C-203E-4C0D-85A9-20D789DE0FA5}">
+  <ds:schemaRefs>
+    <ds:schemaRef ds:uri="http://schemas.microsoft.com/sharepoint/v3/contenttype/forms"/>
+  </ds:schemaRefs>
+</ds:datastoreItem>
 </file>
 
-<file path=customXml/itemProps1.xml><?xml version="1.0" encoding="utf-8"?>
+<file path=customXml/itemProps3.xml><?xml version="1.0" encoding="utf-8"?>
 <ds:datastoreItem xmlns:ds="http://schemas.openxmlformats.org/officeDocument/2006/customXml" ds:itemID="{E5CAAADD-5EFA-6047-86AF-D47B791FFF73}">
   <ds:schemaRefs>
     <ds:schemaRef ds:uri="http://schemas.openxmlformats.org/officeDocument/2006/bibliography"/>
@@ -39539,14 +40350,15 @@
 </ds:datastoreItem>
 </file>
 
-<file path=customXml/itemProps2.xml><?xml version="1.0" encoding="utf-8"?>
-<ds:datastoreItem xmlns:ds="http://schemas.openxmlformats.org/officeDocument/2006/customXml" ds:itemID="{CA04803F-38A4-427F-83B5-157200DCBBE9}">
+<file path=customXml/itemProps4.xml><?xml version="1.0" encoding="utf-8"?>
+<ds:datastoreItem xmlns:ds="http://schemas.openxmlformats.org/officeDocument/2006/customXml" ds:itemID="{4F34B854-79EC-4830-9A45-B17AC56CEDB4}">
   <ds:schemaRefs>
     <ds:schemaRef ds:uri="http://schemas.microsoft.com/office/2006/metadata/contentType"/>
     <ds:schemaRef ds:uri="http://schemas.microsoft.com/office/2006/metadata/properties/metaAttributes"/>
     <ds:schemaRef ds:uri="http://www.w3.org/2001/XMLSchema"/>
     <ds:schemaRef ds:uri="http://schemas.microsoft.com/office/2006/metadata/properties"/>
-    <ds:schemaRef ds:uri="73091f6d-7efc-4d80-b345-57c665de3b33"/>
+    <ds:schemaRef ds:uri="842baacf-de45-4b8d-9e7b-d034e0eebef0"/>
+    <ds:schemaRef ds:uri="ab6a8521-2e52-4959-802d-4d18c7b29c90"/>
     <ds:schemaRef ds:uri="http://schemas.microsoft.com/office/2006/documentManagement/types"/>
     <ds:schemaRef ds:uri="http://schemas.microsoft.com/office/infopath/2007/PartnerControls"/>
     <ds:schemaRef ds:uri="http://schemas.openxmlformats.org/package/2006/metadata/core-properties"/>
@@ -39555,21 +40367,4 @@
     <ds:schemaRef ds:uri="http://schemas.microsoft.com/internal/obd"/>
   </ds:schemaRefs>
 </ds:datastoreItem>
-</file>
-
-<file path=customXml/itemProps3.xml><?xml version="1.0" encoding="utf-8"?>
-<ds:datastoreItem xmlns:ds="http://schemas.openxmlformats.org/officeDocument/2006/customXml" ds:itemID="{7A92FC2C-203E-4C0D-85A9-20D789DE0FA5}">
-  <ds:schemaRefs>
-    <ds:schemaRef ds:uri="http://schemas.microsoft.com/sharepoint/v3/contenttype/forms"/>
-  </ds:schemaRefs>
-</ds:datastoreItem>
-</file>
-
-<file path=customXml/itemProps4.xml><?xml version="1.0" encoding="utf-8"?>
-<ds:datastoreItem xmlns:ds="http://schemas.openxmlformats.org/officeDocument/2006/customXml" ds:itemID="{B1FF55AB-12A0-4DCC-B57A-E7539478881A}">
-  <ds:schemaRefs>
-    <ds:schemaRef ds:uri="http://schemas.microsoft.com/office/2006/metadata/properties"/>
-    <ds:schemaRef ds:uri="http://schemas.microsoft.com/office/infopath/2007/PartnerControls"/>
-  </ds:schemaRefs>
-</ds:datastoreItem>
 </file>
</xml_diff>